<commit_message>
Codigo C++ del controlador
</commit_message>
<xml_diff>
--- a/PROYECTO DIGITAL TWIN JOLEHISY ACEVEDO MEDINA.docx
+++ b/PROYECTO DIGITAL TWIN JOLEHISY ACEVEDO MEDINA.docx
@@ -210,6 +210,20 @@
           </w:r>
         </w:p>
         <w:p>
+          <w:pPr>
+            <w:pStyle w:val="TDC1"/>
+            <w:tabs>
+              <w:tab w:val="right" w:leader="dot" w:pos="10456"/>
+            </w:tabs>
+            <w:rPr>
+              <w:rFonts w:asciiTheme="minorHAnsi" w:eastAsiaTheme="minorEastAsia" w:hAnsiTheme="minorHAnsi" w:cstheme="minorBidi"/>
+              <w:noProof/>
+              <w:kern w:val="2"/>
+              <w:szCs w:val="24"/>
+              <w:lang w:eastAsia="es-ES"/>
+              <w14:ligatures w14:val="standardContextual"/>
+            </w:rPr>
+          </w:pPr>
           <w:r>
             <w:fldChar w:fldCharType="begin"/>
           </w:r>
@@ -219,14 +233,795 @@
           <w:r>
             <w:fldChar w:fldCharType="separate"/>
           </w:r>
-          <w:r>
+          <w:hyperlink w:anchor="_Toc224668007" w:history="1">
+            <w:r>
+              <w:rPr>
+                <w:rStyle w:val="Hipervnculo"/>
+                <w:noProof/>
+              </w:rPr>
+              <w:t>1. Introducción y Objetivos</w:t>
+            </w:r>
+            <w:r>
+              <w:rPr>
+                <w:noProof/>
+                <w:webHidden/>
+              </w:rPr>
+              <w:tab/>
+            </w:r>
+            <w:r>
+              <w:rPr>
+                <w:noProof/>
+                <w:webHidden/>
+              </w:rPr>
+              <w:fldChar w:fldCharType="begin"/>
+            </w:r>
+            <w:r>
+              <w:rPr>
+                <w:noProof/>
+                <w:webHidden/>
+              </w:rPr>
+              <w:instrText xml:space="preserve"> PAGEREF _Toc224668007 \h </w:instrText>
+            </w:r>
+            <w:r>
+              <w:rPr>
+                <w:noProof/>
+                <w:webHidden/>
+              </w:rPr>
+            </w:r>
+            <w:r>
+              <w:rPr>
+                <w:noProof/>
+                <w:webHidden/>
+              </w:rPr>
+              <w:fldChar w:fldCharType="separate"/>
+            </w:r>
+            <w:r>
+              <w:rPr>
+                <w:noProof/>
+                <w:webHidden/>
+              </w:rPr>
+              <w:t>3</w:t>
+            </w:r>
+            <w:r>
+              <w:rPr>
+                <w:noProof/>
+                <w:webHidden/>
+              </w:rPr>
+              <w:fldChar w:fldCharType="end"/>
+            </w:r>
+          </w:hyperlink>
+        </w:p>
+        <w:p>
+          <w:pPr>
+            <w:pStyle w:val="TDC1"/>
+            <w:tabs>
+              <w:tab w:val="right" w:leader="dot" w:pos="10456"/>
+            </w:tabs>
             <w:rPr>
-              <w:b/>
-              <w:bCs/>
+              <w:rFonts w:asciiTheme="minorHAnsi" w:eastAsiaTheme="minorEastAsia" w:hAnsiTheme="minorHAnsi" w:cstheme="minorBidi"/>
               <w:noProof/>
+              <w:kern w:val="2"/>
+              <w:szCs w:val="24"/>
+              <w:lang w:eastAsia="es-ES"/>
+              <w14:ligatures w14:val="standardContextual"/>
             </w:rPr>
-            <w:t>No se encontraron entradas de tabla de contenido.</w:t>
-          </w:r>
+          </w:pPr>
+          <w:hyperlink w:anchor="_Toc224668008" w:history="1">
+            <w:r>
+              <w:rPr>
+                <w:rStyle w:val="Hipervnculo"/>
+                <w:noProof/>
+              </w:rPr>
+              <w:t>2. Selección y Adaptación del Modelo Digital</w:t>
+            </w:r>
+            <w:r>
+              <w:rPr>
+                <w:noProof/>
+                <w:webHidden/>
+              </w:rPr>
+              <w:tab/>
+            </w:r>
+            <w:r>
+              <w:rPr>
+                <w:noProof/>
+                <w:webHidden/>
+              </w:rPr>
+              <w:fldChar w:fldCharType="begin"/>
+            </w:r>
+            <w:r>
+              <w:rPr>
+                <w:noProof/>
+                <w:webHidden/>
+              </w:rPr>
+              <w:instrText xml:space="preserve"> PAGEREF _Toc224668008 \h </w:instrText>
+            </w:r>
+            <w:r>
+              <w:rPr>
+                <w:noProof/>
+                <w:webHidden/>
+              </w:rPr>
+            </w:r>
+            <w:r>
+              <w:rPr>
+                <w:noProof/>
+                <w:webHidden/>
+              </w:rPr>
+              <w:fldChar w:fldCharType="separate"/>
+            </w:r>
+            <w:r>
+              <w:rPr>
+                <w:noProof/>
+                <w:webHidden/>
+              </w:rPr>
+              <w:t>4</w:t>
+            </w:r>
+            <w:r>
+              <w:rPr>
+                <w:noProof/>
+                <w:webHidden/>
+              </w:rPr>
+              <w:fldChar w:fldCharType="end"/>
+            </w:r>
+          </w:hyperlink>
+        </w:p>
+        <w:p>
+          <w:pPr>
+            <w:pStyle w:val="TDC2"/>
+            <w:tabs>
+              <w:tab w:val="right" w:leader="dot" w:pos="10456"/>
+            </w:tabs>
+            <w:rPr>
+              <w:rFonts w:asciiTheme="minorHAnsi" w:eastAsiaTheme="minorEastAsia" w:hAnsiTheme="minorHAnsi" w:cstheme="minorBidi"/>
+              <w:noProof/>
+              <w:kern w:val="2"/>
+              <w:szCs w:val="24"/>
+              <w:lang w:eastAsia="es-ES"/>
+              <w14:ligatures w14:val="standardContextual"/>
+            </w:rPr>
+          </w:pPr>
+          <w:hyperlink w:anchor="_Toc224668009" w:history="1">
+            <w:r>
+              <w:rPr>
+                <w:rStyle w:val="Hipervnculo"/>
+                <w:noProof/>
+              </w:rPr>
+              <w:t>2.1. Sintonización del Controlador PID Discreto</w:t>
+            </w:r>
+            <w:r>
+              <w:rPr>
+                <w:noProof/>
+                <w:webHidden/>
+              </w:rPr>
+              <w:tab/>
+            </w:r>
+            <w:r>
+              <w:rPr>
+                <w:noProof/>
+                <w:webHidden/>
+              </w:rPr>
+              <w:fldChar w:fldCharType="begin"/>
+            </w:r>
+            <w:r>
+              <w:rPr>
+                <w:noProof/>
+                <w:webHidden/>
+              </w:rPr>
+              <w:instrText xml:space="preserve"> PAGEREF _Toc224668009 \h </w:instrText>
+            </w:r>
+            <w:r>
+              <w:rPr>
+                <w:noProof/>
+                <w:webHidden/>
+              </w:rPr>
+            </w:r>
+            <w:r>
+              <w:rPr>
+                <w:noProof/>
+                <w:webHidden/>
+              </w:rPr>
+              <w:fldChar w:fldCharType="separate"/>
+            </w:r>
+            <w:r>
+              <w:rPr>
+                <w:noProof/>
+                <w:webHidden/>
+              </w:rPr>
+              <w:t>4</w:t>
+            </w:r>
+            <w:r>
+              <w:rPr>
+                <w:noProof/>
+                <w:webHidden/>
+              </w:rPr>
+              <w:fldChar w:fldCharType="end"/>
+            </w:r>
+          </w:hyperlink>
+        </w:p>
+        <w:p>
+          <w:pPr>
+            <w:pStyle w:val="TDC2"/>
+            <w:tabs>
+              <w:tab w:val="right" w:leader="dot" w:pos="10456"/>
+            </w:tabs>
+            <w:rPr>
+              <w:rFonts w:asciiTheme="minorHAnsi" w:eastAsiaTheme="minorEastAsia" w:hAnsiTheme="minorHAnsi" w:cstheme="minorBidi"/>
+              <w:noProof/>
+              <w:kern w:val="2"/>
+              <w:szCs w:val="24"/>
+              <w:lang w:eastAsia="es-ES"/>
+              <w14:ligatures w14:val="standardContextual"/>
+            </w:rPr>
+          </w:pPr>
+          <w:hyperlink w:anchor="_Toc224668010" w:history="1">
+            <w:r>
+              <w:rPr>
+                <w:rStyle w:val="Hipervnculo"/>
+                <w:noProof/>
+              </w:rPr>
+              <w:t>2.2. Modelado del Entorno Real (Fidelidad del Gemelo Digital)</w:t>
+            </w:r>
+            <w:r>
+              <w:rPr>
+                <w:noProof/>
+                <w:webHidden/>
+              </w:rPr>
+              <w:tab/>
+            </w:r>
+            <w:r>
+              <w:rPr>
+                <w:noProof/>
+                <w:webHidden/>
+              </w:rPr>
+              <w:fldChar w:fldCharType="begin"/>
+            </w:r>
+            <w:r>
+              <w:rPr>
+                <w:noProof/>
+                <w:webHidden/>
+              </w:rPr>
+              <w:instrText xml:space="preserve"> PAGEREF _Toc224668010 \h </w:instrText>
+            </w:r>
+            <w:r>
+              <w:rPr>
+                <w:noProof/>
+                <w:webHidden/>
+              </w:rPr>
+            </w:r>
+            <w:r>
+              <w:rPr>
+                <w:noProof/>
+                <w:webHidden/>
+              </w:rPr>
+              <w:fldChar w:fldCharType="separate"/>
+            </w:r>
+            <w:r>
+              <w:rPr>
+                <w:noProof/>
+                <w:webHidden/>
+              </w:rPr>
+              <w:t>6</w:t>
+            </w:r>
+            <w:r>
+              <w:rPr>
+                <w:noProof/>
+                <w:webHidden/>
+              </w:rPr>
+              <w:fldChar w:fldCharType="end"/>
+            </w:r>
+          </w:hyperlink>
+        </w:p>
+        <w:p>
+          <w:pPr>
+            <w:pStyle w:val="TDC3"/>
+            <w:tabs>
+              <w:tab w:val="right" w:leader="dot" w:pos="10456"/>
+            </w:tabs>
+            <w:rPr>
+              <w:rFonts w:asciiTheme="minorHAnsi" w:eastAsiaTheme="minorEastAsia" w:hAnsiTheme="minorHAnsi" w:cstheme="minorBidi"/>
+              <w:noProof/>
+              <w:kern w:val="2"/>
+              <w:szCs w:val="24"/>
+              <w:lang w:eastAsia="es-ES"/>
+              <w14:ligatures w14:val="standardContextual"/>
+            </w:rPr>
+          </w:pPr>
+          <w:hyperlink w:anchor="_Toc224668011" w:history="1">
+            <w:r>
+              <w:rPr>
+                <w:rStyle w:val="Hipervnculo"/>
+                <w:noProof/>
+              </w:rPr>
+              <w:t>2.2.1. Dinámica del Actuador y Respuesta Térmica</w:t>
+            </w:r>
+            <w:r>
+              <w:rPr>
+                <w:noProof/>
+                <w:webHidden/>
+              </w:rPr>
+              <w:tab/>
+            </w:r>
+            <w:r>
+              <w:rPr>
+                <w:noProof/>
+                <w:webHidden/>
+              </w:rPr>
+              <w:fldChar w:fldCharType="begin"/>
+            </w:r>
+            <w:r>
+              <w:rPr>
+                <w:noProof/>
+                <w:webHidden/>
+              </w:rPr>
+              <w:instrText xml:space="preserve"> PAGEREF _Toc224668011 \h </w:instrText>
+            </w:r>
+            <w:r>
+              <w:rPr>
+                <w:noProof/>
+                <w:webHidden/>
+              </w:rPr>
+            </w:r>
+            <w:r>
+              <w:rPr>
+                <w:noProof/>
+                <w:webHidden/>
+              </w:rPr>
+              <w:fldChar w:fldCharType="separate"/>
+            </w:r>
+            <w:r>
+              <w:rPr>
+                <w:noProof/>
+                <w:webHidden/>
+              </w:rPr>
+              <w:t>6</w:t>
+            </w:r>
+            <w:r>
+              <w:rPr>
+                <w:noProof/>
+                <w:webHidden/>
+              </w:rPr>
+              <w:fldChar w:fldCharType="end"/>
+            </w:r>
+          </w:hyperlink>
+        </w:p>
+        <w:p>
+          <w:pPr>
+            <w:pStyle w:val="TDC3"/>
+            <w:tabs>
+              <w:tab w:val="right" w:leader="dot" w:pos="10456"/>
+            </w:tabs>
+            <w:rPr>
+              <w:rFonts w:asciiTheme="minorHAnsi" w:eastAsiaTheme="minorEastAsia" w:hAnsiTheme="minorHAnsi" w:cstheme="minorBidi"/>
+              <w:noProof/>
+              <w:kern w:val="2"/>
+              <w:szCs w:val="24"/>
+              <w:lang w:eastAsia="es-ES"/>
+              <w14:ligatures w14:val="standardContextual"/>
+            </w:rPr>
+          </w:pPr>
+          <w:hyperlink w:anchor="_Toc224668012" w:history="1">
+            <w:r>
+              <w:rPr>
+                <w:rStyle w:val="Hipervnculo"/>
+                <w:noProof/>
+              </w:rPr>
+              <w:t>2.2.2. Turbulencia Atmosférica Estocástica (Mach Variable)</w:t>
+            </w:r>
+            <w:r>
+              <w:rPr>
+                <w:noProof/>
+                <w:webHidden/>
+              </w:rPr>
+              <w:tab/>
+            </w:r>
+            <w:r>
+              <w:rPr>
+                <w:noProof/>
+                <w:webHidden/>
+              </w:rPr>
+              <w:fldChar w:fldCharType="begin"/>
+            </w:r>
+            <w:r>
+              <w:rPr>
+                <w:noProof/>
+                <w:webHidden/>
+              </w:rPr>
+              <w:instrText xml:space="preserve"> PAGEREF _Toc224668012 \h </w:instrText>
+            </w:r>
+            <w:r>
+              <w:rPr>
+                <w:noProof/>
+                <w:webHidden/>
+              </w:rPr>
+            </w:r>
+            <w:r>
+              <w:rPr>
+                <w:noProof/>
+                <w:webHidden/>
+              </w:rPr>
+              <w:fldChar w:fldCharType="separate"/>
+            </w:r>
+            <w:r>
+              <w:rPr>
+                <w:noProof/>
+                <w:webHidden/>
+              </w:rPr>
+              <w:t>6</w:t>
+            </w:r>
+            <w:r>
+              <w:rPr>
+                <w:noProof/>
+                <w:webHidden/>
+              </w:rPr>
+              <w:fldChar w:fldCharType="end"/>
+            </w:r>
+          </w:hyperlink>
+        </w:p>
+        <w:p>
+          <w:pPr>
+            <w:pStyle w:val="TDC1"/>
+            <w:tabs>
+              <w:tab w:val="right" w:leader="dot" w:pos="10456"/>
+            </w:tabs>
+            <w:rPr>
+              <w:rFonts w:asciiTheme="minorHAnsi" w:eastAsiaTheme="minorEastAsia" w:hAnsiTheme="minorHAnsi" w:cstheme="minorBidi"/>
+              <w:noProof/>
+              <w:kern w:val="2"/>
+              <w:szCs w:val="24"/>
+              <w:lang w:eastAsia="es-ES"/>
+              <w14:ligatures w14:val="standardContextual"/>
+            </w:rPr>
+          </w:pPr>
+          <w:hyperlink w:anchor="_Toc224668013" w:history="1">
+            <w:r>
+              <w:rPr>
+                <w:rStyle w:val="Hipervnculo"/>
+                <w:noProof/>
+              </w:rPr>
+              <w:t>3. Arquitectura del Sistema: Subsistemas y Enmascaramiento</w:t>
+            </w:r>
+            <w:r>
+              <w:rPr>
+                <w:noProof/>
+                <w:webHidden/>
+              </w:rPr>
+              <w:tab/>
+            </w:r>
+            <w:r>
+              <w:rPr>
+                <w:noProof/>
+                <w:webHidden/>
+              </w:rPr>
+              <w:fldChar w:fldCharType="begin"/>
+            </w:r>
+            <w:r>
+              <w:rPr>
+                <w:noProof/>
+                <w:webHidden/>
+              </w:rPr>
+              <w:instrText xml:space="preserve"> PAGEREF _Toc224668013 \h </w:instrText>
+            </w:r>
+            <w:r>
+              <w:rPr>
+                <w:noProof/>
+                <w:webHidden/>
+              </w:rPr>
+            </w:r>
+            <w:r>
+              <w:rPr>
+                <w:noProof/>
+                <w:webHidden/>
+              </w:rPr>
+              <w:fldChar w:fldCharType="separate"/>
+            </w:r>
+            <w:r>
+              <w:rPr>
+                <w:noProof/>
+                <w:webHidden/>
+              </w:rPr>
+              <w:t>7</w:t>
+            </w:r>
+            <w:r>
+              <w:rPr>
+                <w:noProof/>
+                <w:webHidden/>
+              </w:rPr>
+              <w:fldChar w:fldCharType="end"/>
+            </w:r>
+          </w:hyperlink>
+        </w:p>
+        <w:p>
+          <w:pPr>
+            <w:pStyle w:val="TDC2"/>
+            <w:tabs>
+              <w:tab w:val="right" w:leader="dot" w:pos="10456"/>
+            </w:tabs>
+            <w:rPr>
+              <w:rFonts w:asciiTheme="minorHAnsi" w:eastAsiaTheme="minorEastAsia" w:hAnsiTheme="minorHAnsi" w:cstheme="minorBidi"/>
+              <w:noProof/>
+              <w:kern w:val="2"/>
+              <w:szCs w:val="24"/>
+              <w:lang w:eastAsia="es-ES"/>
+              <w14:ligatures w14:val="standardContextual"/>
+            </w:rPr>
+          </w:pPr>
+          <w:hyperlink w:anchor="_Toc224668014" w:history="1">
+            <w:r>
+              <w:rPr>
+                <w:rStyle w:val="Hipervnculo"/>
+                <w:noProof/>
+              </w:rPr>
+              <w:t>3.1. Segmentación de Componentes</w:t>
+            </w:r>
+            <w:r>
+              <w:rPr>
+                <w:noProof/>
+                <w:webHidden/>
+              </w:rPr>
+              <w:tab/>
+            </w:r>
+            <w:r>
+              <w:rPr>
+                <w:noProof/>
+                <w:webHidden/>
+              </w:rPr>
+              <w:fldChar w:fldCharType="begin"/>
+            </w:r>
+            <w:r>
+              <w:rPr>
+                <w:noProof/>
+                <w:webHidden/>
+              </w:rPr>
+              <w:instrText xml:space="preserve"> PAGEREF _Toc224668014 \h </w:instrText>
+            </w:r>
+            <w:r>
+              <w:rPr>
+                <w:noProof/>
+                <w:webHidden/>
+              </w:rPr>
+            </w:r>
+            <w:r>
+              <w:rPr>
+                <w:noProof/>
+                <w:webHidden/>
+              </w:rPr>
+              <w:fldChar w:fldCharType="separate"/>
+            </w:r>
+            <w:r>
+              <w:rPr>
+                <w:noProof/>
+                <w:webHidden/>
+              </w:rPr>
+              <w:t>7</w:t>
+            </w:r>
+            <w:r>
+              <w:rPr>
+                <w:noProof/>
+                <w:webHidden/>
+              </w:rPr>
+              <w:fldChar w:fldCharType="end"/>
+            </w:r>
+          </w:hyperlink>
+        </w:p>
+        <w:p>
+          <w:pPr>
+            <w:pStyle w:val="TDC2"/>
+            <w:tabs>
+              <w:tab w:val="right" w:leader="dot" w:pos="10456"/>
+            </w:tabs>
+            <w:rPr>
+              <w:rFonts w:asciiTheme="minorHAnsi" w:eastAsiaTheme="minorEastAsia" w:hAnsiTheme="minorHAnsi" w:cstheme="minorBidi"/>
+              <w:noProof/>
+              <w:kern w:val="2"/>
+              <w:szCs w:val="24"/>
+              <w:lang w:eastAsia="es-ES"/>
+              <w14:ligatures w14:val="standardContextual"/>
+            </w:rPr>
+          </w:pPr>
+          <w:hyperlink w:anchor="_Toc224668015" w:history="1">
+            <w:r>
+              <w:rPr>
+                <w:rStyle w:val="Hipervnculo"/>
+                <w:noProof/>
+              </w:rPr>
+              <w:t>3.2. Diseño de la Máscara de Control</w:t>
+            </w:r>
+            <w:r>
+              <w:rPr>
+                <w:noProof/>
+                <w:webHidden/>
+              </w:rPr>
+              <w:tab/>
+            </w:r>
+            <w:r>
+              <w:rPr>
+                <w:noProof/>
+                <w:webHidden/>
+              </w:rPr>
+              <w:fldChar w:fldCharType="begin"/>
+            </w:r>
+            <w:r>
+              <w:rPr>
+                <w:noProof/>
+                <w:webHidden/>
+              </w:rPr>
+              <w:instrText xml:space="preserve"> PAGEREF _Toc224668015 \h </w:instrText>
+            </w:r>
+            <w:r>
+              <w:rPr>
+                <w:noProof/>
+                <w:webHidden/>
+              </w:rPr>
+            </w:r>
+            <w:r>
+              <w:rPr>
+                <w:noProof/>
+                <w:webHidden/>
+              </w:rPr>
+              <w:fldChar w:fldCharType="separate"/>
+            </w:r>
+            <w:r>
+              <w:rPr>
+                <w:noProof/>
+                <w:webHidden/>
+              </w:rPr>
+              <w:t>8</w:t>
+            </w:r>
+            <w:r>
+              <w:rPr>
+                <w:noProof/>
+                <w:webHidden/>
+              </w:rPr>
+              <w:fldChar w:fldCharType="end"/>
+            </w:r>
+          </w:hyperlink>
+        </w:p>
+        <w:p>
+          <w:pPr>
+            <w:pStyle w:val="TDC2"/>
+            <w:tabs>
+              <w:tab w:val="right" w:leader="dot" w:pos="10456"/>
+            </w:tabs>
+            <w:rPr>
+              <w:rFonts w:asciiTheme="minorHAnsi" w:eastAsiaTheme="minorEastAsia" w:hAnsiTheme="minorHAnsi" w:cstheme="minorBidi"/>
+              <w:noProof/>
+              <w:kern w:val="2"/>
+              <w:szCs w:val="24"/>
+              <w:lang w:eastAsia="es-ES"/>
+              <w14:ligatures w14:val="standardContextual"/>
+            </w:rPr>
+          </w:pPr>
+          <w:hyperlink w:anchor="_Toc224668016" w:history="1">
+            <w:r>
+              <w:rPr>
+                <w:rStyle w:val="Hipervnculo"/>
+                <w:noProof/>
+              </w:rPr>
+              <w:t>3.3. Interfaz de Señales</w:t>
+            </w:r>
+            <w:r>
+              <w:rPr>
+                <w:noProof/>
+                <w:webHidden/>
+              </w:rPr>
+              <w:tab/>
+            </w:r>
+            <w:r>
+              <w:rPr>
+                <w:noProof/>
+                <w:webHidden/>
+              </w:rPr>
+              <w:fldChar w:fldCharType="begin"/>
+            </w:r>
+            <w:r>
+              <w:rPr>
+                <w:noProof/>
+                <w:webHidden/>
+              </w:rPr>
+              <w:instrText xml:space="preserve"> PAGEREF _Toc224668016 \h </w:instrText>
+            </w:r>
+            <w:r>
+              <w:rPr>
+                <w:noProof/>
+                <w:webHidden/>
+              </w:rPr>
+            </w:r>
+            <w:r>
+              <w:rPr>
+                <w:noProof/>
+                <w:webHidden/>
+              </w:rPr>
+              <w:fldChar w:fldCharType="separate"/>
+            </w:r>
+            <w:r>
+              <w:rPr>
+                <w:noProof/>
+                <w:webHidden/>
+              </w:rPr>
+              <w:t>8</w:t>
+            </w:r>
+            <w:r>
+              <w:rPr>
+                <w:noProof/>
+                <w:webHidden/>
+              </w:rPr>
+              <w:fldChar w:fldCharType="end"/>
+            </w:r>
+          </w:hyperlink>
+        </w:p>
+        <w:p>
+          <w:pPr>
+            <w:pStyle w:val="TDC2"/>
+            <w:tabs>
+              <w:tab w:val="right" w:leader="dot" w:pos="10456"/>
+            </w:tabs>
+            <w:rPr>
+              <w:rFonts w:asciiTheme="minorHAnsi" w:eastAsiaTheme="minorEastAsia" w:hAnsiTheme="minorHAnsi" w:cstheme="minorBidi"/>
+              <w:noProof/>
+              <w:kern w:val="2"/>
+              <w:szCs w:val="24"/>
+              <w:lang w:eastAsia="es-ES"/>
+              <w14:ligatures w14:val="standardContextual"/>
+            </w:rPr>
+          </w:pPr>
+          <w:hyperlink w:anchor="_Toc224668017" w:history="1">
+            <w:r>
+              <w:rPr>
+                <w:rStyle w:val="Hipervnculo"/>
+                <w:noProof/>
+              </w:rPr>
+              <w:t>2.2.2. Simulación de Descenso Dinámico (Variación de Densidad)</w:t>
+            </w:r>
+            <w:r>
+              <w:rPr>
+                <w:noProof/>
+                <w:webHidden/>
+              </w:rPr>
+              <w:tab/>
+            </w:r>
+            <w:r>
+              <w:rPr>
+                <w:noProof/>
+                <w:webHidden/>
+              </w:rPr>
+              <w:fldChar w:fldCharType="begin"/>
+            </w:r>
+            <w:r>
+              <w:rPr>
+                <w:noProof/>
+                <w:webHidden/>
+              </w:rPr>
+              <w:instrText xml:space="preserve"> PAGEREF _Toc224668017 \h </w:instrText>
+            </w:r>
+            <w:r>
+              <w:rPr>
+                <w:noProof/>
+                <w:webHidden/>
+              </w:rPr>
+            </w:r>
+            <w:r>
+              <w:rPr>
+                <w:noProof/>
+                <w:webHidden/>
+              </w:rPr>
+              <w:fldChar w:fldCharType="separate"/>
+            </w:r>
+            <w:r>
+              <w:rPr>
+                <w:noProof/>
+                <w:webHidden/>
+              </w:rPr>
+              <w:t>9</w:t>
+            </w:r>
+            <w:r>
+              <w:rPr>
+                <w:noProof/>
+                <w:webHidden/>
+              </w:rPr>
+              <w:fldChar w:fldCharType="end"/>
+            </w:r>
+          </w:hyperlink>
+        </w:p>
+        <w:p>
           <w:r>
             <w:rPr>
               <w:b/>
@@ -245,16 +1040,19 @@
     <w:p>
       <w:pPr>
         <w:pStyle w:val="Ttulo1"/>
-        <w:numPr>
-          <w:ilvl w:val="0"/>
-          <w:numId w:val="2"/>
-        </w:numPr>
         <w:spacing w:afterAutospacing="0"/>
-        <w:ind w:left="284" w:hanging="284"/>
-      </w:pPr>
+      </w:pPr>
+      <w:bookmarkStart w:id="0" w:name="_Toc224668007"/>
+      <w:r>
+        <w:t>1.</w:t>
+      </w:r>
+      <w:r>
+        <w:t xml:space="preserve"> </w:t>
+      </w:r>
       <w:r>
         <w:t>Introducción y Objetivos</w:t>
       </w:r>
+      <w:bookmarkEnd w:id="0"/>
     </w:p>
     <w:p>
       <w:pPr>
@@ -265,13 +1063,47 @@
       <w:r>
         <w:t>El presente proyecto tiene como objetivo el diseño, implementación y validación de un sistema de control digital de empuje (FADEC) para un motor de aviación mediante un modelo de turbina de gas comercial (</w:t>
       </w:r>
+      <w:proofErr w:type="spellStart"/>
       <w:r>
         <w:rPr>
           <w:i/>
           <w:iCs/>
         </w:rPr>
-        <w:t>Turbofan Engine System</w:t>
-      </w:r>
+        <w:t>Turbofan</w:t>
+      </w:r>
+      <w:proofErr w:type="spellEnd"/>
+      <w:r>
+        <w:rPr>
+          <w:i/>
+          <w:iCs/>
+        </w:rPr>
+        <w:t xml:space="preserve"> </w:t>
+      </w:r>
+      <w:proofErr w:type="spellStart"/>
+      <w:r>
+        <w:rPr>
+          <w:i/>
+          <w:iCs/>
+        </w:rPr>
+        <w:t>Engine</w:t>
+      </w:r>
+      <w:proofErr w:type="spellEnd"/>
+      <w:r>
+        <w:rPr>
+          <w:i/>
+          <w:iCs/>
+        </w:rPr>
+        <w:t xml:space="preserve"> </w:t>
+      </w:r>
+      <w:proofErr w:type="spellStart"/>
+      <w:r>
+        <w:rPr>
+          <w:i/>
+          <w:iCs/>
+        </w:rPr>
+        <w:t>System</w:t>
+      </w:r>
+      <w:proofErr w:type="spellEnd"/>
       <w:r>
         <w:t>). El trabajo se ha estructurado para dar respuesta a los requisitos técnicos del programa, evolucionando un modelo termodinámico hacia un "Digital Twin" de alta fidelidad.</w:t>
       </w:r>
@@ -420,8 +1252,19 @@
           <w:sz w:val="24"/>
           <w:szCs w:val="24"/>
         </w:rPr>
-        <w:t>.slxp</w:t>
-      </w:r>
+        <w:t>.</w:t>
+      </w:r>
+      <w:proofErr w:type="spellStart"/>
+      <w:r>
+        <w:rPr>
+          <w:rStyle w:val="CdigoHTML"/>
+          <w:rFonts w:ascii="Times New Roman" w:eastAsiaTheme="majorEastAsia" w:hAnsi="Times New Roman" w:cs="Times New Roman"/>
+          <w:sz w:val="24"/>
+          <w:szCs w:val="24"/>
+        </w:rPr>
+        <w:t>slxp</w:t>
+      </w:r>
+      <w:proofErr w:type="spellEnd"/>
       <w:r>
         <w:t>), permitiendo realizar pruebas de rendimiento ante cambios de referencias de vuelo sin exponer la propiedad intelectual del diseño.</w:t>
       </w:r>
@@ -511,23 +1354,67 @@
         <w:pStyle w:val="Ttulo1"/>
         <w:spacing w:afterAutospacing="0"/>
       </w:pPr>
+      <w:bookmarkStart w:id="1" w:name="_Toc224668008"/>
       <w:r>
         <w:t>2. Selección y Adaptación del Modelo Digital</w:t>
       </w:r>
+      <w:bookmarkEnd w:id="1"/>
     </w:p>
     <w:p>
       <w:r>
         <w:t xml:space="preserve">Para este proyecto se ha seleccionado el modelo de referencia de la librería </w:t>
       </w:r>
+      <w:proofErr w:type="spellStart"/>
       <w:r>
         <w:rPr>
           <w:i/>
           <w:iCs/>
         </w:rPr>
-        <w:t>Aerospace Blockset</w:t>
-      </w:r>
-      <w:r>
-        <w:t xml:space="preserve"> de Simulink (Turbofan Engine System). Este bloque representa la física continua y no lineal de una turbina de gas. Sin embargo, para cumplir con los objetivos de control digital específicos y acercar la simulación a la realidad del hardware de a bordo, se han realizado las siguientes adaptaciones:</w:t>
+        <w:t>Aerospace</w:t>
+      </w:r>
+      <w:proofErr w:type="spellEnd"/>
+      <w:r>
+        <w:rPr>
+          <w:i/>
+          <w:iCs/>
+        </w:rPr>
+        <w:t xml:space="preserve"> </w:t>
+      </w:r>
+      <w:proofErr w:type="spellStart"/>
+      <w:r>
+        <w:rPr>
+          <w:i/>
+          <w:iCs/>
+        </w:rPr>
+        <w:t>Blockset</w:t>
+      </w:r>
+      <w:proofErr w:type="spellEnd"/>
+      <w:r>
+        <w:t xml:space="preserve"> de Simulink (</w:t>
+      </w:r>
+      <w:proofErr w:type="spellStart"/>
+      <w:r>
+        <w:t>Turbofan</w:t>
+      </w:r>
+      <w:proofErr w:type="spellEnd"/>
+      <w:r>
+        <w:t xml:space="preserve"> </w:t>
+      </w:r>
+      <w:proofErr w:type="spellStart"/>
+      <w:r>
+        <w:t>Engine</w:t>
+      </w:r>
+      <w:proofErr w:type="spellEnd"/>
+      <w:r>
+        <w:t xml:space="preserve"> </w:t>
+      </w:r>
+      <w:proofErr w:type="spellStart"/>
+      <w:r>
+        <w:t>System</w:t>
+      </w:r>
+      <w:proofErr w:type="spellEnd"/>
+      <w:r>
+        <w:t>). Este bloque representa la física continua y no lineal de una turbina de gas. Sin embargo, para cumplir con los objetivos de control digital específicos y acercar la simulación a la realidad del hardware de a bordo, se han realizado las siguientes adaptaciones:</w:t>
       </w:r>
     </w:p>
     <w:p>
@@ -552,11 +1439,28 @@
           <w:b/>
           <w:bCs/>
         </w:rPr>
-        <w:t>Zero-Order Hold (ZOH)</w:t>
+        <w:t>Zero-</w:t>
+      </w:r>
+      <w:proofErr w:type="spellStart"/>
+      <w:r>
+        <w:rPr>
+          <w:b/>
+          <w:bCs/>
+        </w:rPr>
+        <w:t>Order</w:t>
+      </w:r>
+      <w:proofErr w:type="spellEnd"/>
+      <w:r>
+        <w:rPr>
+          <w:b/>
+          <w:bCs/>
+        </w:rPr>
+        <w:t xml:space="preserve"> Hold (ZOH)</w:t>
       </w:r>
       <w:r>
         <w:t xml:space="preserve"> en el lazo de realimentación del empuje (</w:t>
       </w:r>
+      <w:proofErr w:type="spellStart"/>
       <w:r>
         <w:rPr>
           <w:i/>
@@ -564,16 +1468,72 @@
         </w:rPr>
         <w:t>Thrust</w:t>
       </w:r>
-      <w:r>
-        <w:t xml:space="preserve">). Este bloque actúa como el conversor analógico-digital del sistema, muestreando la señal física a una frecuencia de 100 Hz ($T_s = 0.01$ s). El controlador PID se ha sincronizado a esta misma frecuencia para evitar la pérdida de datos y crear un sistema de control </w:t>
-      </w:r>
+      <w:proofErr w:type="spellEnd"/>
+      <w:r>
+        <w:t>). Este bloque actúa como el conversor analógico-digital del sistema, muestreando la señal física a una frecuencia de 100 Hz (</w:t>
+      </w:r>
+      <m:oMath>
+        <m:sSub>
+          <m:sSubPr>
+            <m:ctrlPr>
+              <w:rPr>
+                <w:rFonts w:ascii="Cambria Math" w:hAnsi="Cambria Math"/>
+                <w:i/>
+              </w:rPr>
+            </m:ctrlPr>
+          </m:sSubPr>
+          <m:e>
+            <m:r>
+              <w:rPr>
+                <w:rFonts w:ascii="Cambria Math" w:hAnsi="Cambria Math"/>
+              </w:rPr>
+              <m:t>T</m:t>
+            </m:r>
+          </m:e>
+          <m:sub>
+            <m:r>
+              <w:rPr>
+                <w:rFonts w:ascii="Cambria Math" w:hAnsi="Cambria Math"/>
+              </w:rPr>
+              <m:t>s</m:t>
+            </m:r>
+          </m:sub>
+        </m:sSub>
+        <m:r>
+          <w:rPr>
+            <w:rFonts w:ascii="Cambria Math" w:hAnsi="Cambria Math"/>
+          </w:rPr>
+          <m:t>=0.01</m:t>
+        </m:r>
+      </m:oMath>
+      <w:r>
+        <w:t xml:space="preserve"> s). El controlador PID se ha sincronizado a esta misma frecuencia para evitar la pérdida de datos y crear un sistema de control </w:t>
+      </w:r>
+      <w:proofErr w:type="gramStart"/>
       <w:r>
         <w:rPr>
           <w:i/>
           <w:iCs/>
         </w:rPr>
-        <w:t>single-rate</w:t>
-      </w:r>
+        <w:t>single</w:t>
+      </w:r>
+      <w:proofErr w:type="gramEnd"/>
+      <w:r>
+        <w:rPr>
+          <w:i/>
+          <w:iCs/>
+        </w:rPr>
+        <w:t>-</w:t>
+      </w:r>
+      <w:proofErr w:type="spellStart"/>
+      <w:r>
+        <w:rPr>
+          <w:i/>
+          <w:iCs/>
+        </w:rPr>
+        <w:t>rate</w:t>
+      </w:r>
+      <w:proofErr w:type="spellEnd"/>
       <w:r>
         <w:t>.</w:t>
       </w:r>
@@ -590,7 +1550,23 @@
           <w:b/>
           <w:bCs/>
         </w:rPr>
-        <w:t>Limitaciones Físicas del Actuador (Saturación y Anti-windup):</w:t>
+        <w:t xml:space="preserve">Limitaciones Físicas del Actuador (Saturación y </w:t>
+      </w:r>
+      <w:proofErr w:type="spellStart"/>
+      <w:r>
+        <w:rPr>
+          <w:b/>
+          <w:bCs/>
+        </w:rPr>
+        <w:t>Anti-windup</w:t>
+      </w:r>
+      <w:proofErr w:type="spellEnd"/>
+      <w:r>
+        <w:rPr>
+          <w:b/>
+          <w:bCs/>
+        </w:rPr>
+        <w:t>):</w:t>
       </w:r>
       <w:r>
         <w:t xml:space="preserve"> La variable manipulada por el controlador es la posición de la válvula de combustible (</w:t>
@@ -605,6 +1581,7 @@
       <w:r>
         <w:t xml:space="preserve">). Físicamente, esta válvula tiene un recorrido limitado entre el cierre casi total y la apertura máxima. Por ello, se ha configurado la salida del PID Discreto con una saturación estricta entre 0 y 1. Adicionalmente, se ha activado el mecanismo </w:t>
       </w:r>
+      <w:proofErr w:type="spellStart"/>
       <w:r>
         <w:rPr>
           <w:i/>
@@ -612,9 +1589,11 @@
         </w:rPr>
         <w:t>Anti-windup</w:t>
       </w:r>
+      <w:proofErr w:type="spellEnd"/>
       <w:r>
         <w:t xml:space="preserve"> (método </w:t>
       </w:r>
+      <w:proofErr w:type="spellStart"/>
       <w:r>
         <w:rPr>
           <w:i/>
@@ -622,6 +1601,7 @@
         </w:rPr>
         <w:t>clamping</w:t>
       </w:r>
+      <w:proofErr w:type="spellEnd"/>
       <w:r>
         <w:t>) para evitar que el término integral se acumule al infinito cuando el actuador alcanza su límite físico, garantizando la estabilidad del sistema frente a grandes errores de consigna.</w:t>
       </w:r>
@@ -709,14 +1689,25 @@
       <w:pPr>
         <w:pStyle w:val="Ttulo2"/>
       </w:pPr>
+      <w:bookmarkStart w:id="2" w:name="_Toc224668009"/>
       <w:r>
         <w:t>2.1. Sintonización del Controlador PID Discreto</w:t>
       </w:r>
-    </w:p>
-    <w:p>
-      <w:r>
-        <w:t xml:space="preserve">El ajuste de las ganancias del controlador se ha realizado priorizando la estabilidad absoluta y la integridad física de la turbina. En la industria aeroespacial, un exceso de inyección de combustible (sobreoscilación u </w:t>
-      </w:r>
+      <w:bookmarkEnd w:id="2"/>
+    </w:p>
+    <w:p>
+      <w:r>
+        <w:t>El ajuste de las ganancias del controlador se ha realizado priorizando la estabilidad absoluta y la integridad física de la turbina. En la industria aeroespacial, un exceso de inyección de combustible (</w:t>
+      </w:r>
+      <w:proofErr w:type="spellStart"/>
+      <w:r>
+        <w:t>sobreoscilación</w:t>
+      </w:r>
+      <w:proofErr w:type="spellEnd"/>
+      <w:r>
+        <w:t xml:space="preserve"> u </w:t>
+      </w:r>
+      <w:proofErr w:type="spellStart"/>
       <w:r>
         <w:rPr>
           <w:i/>
@@ -724,6 +1715,7 @@
         </w:rPr>
         <w:t>overshoot</w:t>
       </w:r>
+      <w:proofErr w:type="spellEnd"/>
       <w:r>
         <w:t>) provoca picos de temperatura en los gases de escape que pueden fundir los álabes de la turbina. Por tanto, el objetivo principal de la sintonización ha sido obtener una respuesta suave, sin picos, y con un error en régimen permanente nulo.</w:t>
       </w:r>
@@ -826,6 +1818,7 @@
       <w:r>
         <w:t xml:space="preserve"> Gracias a las ganancias seleccionadas y al uso del método </w:t>
       </w:r>
+      <w:proofErr w:type="spellStart"/>
       <w:r>
         <w:rPr>
           <w:i/>
@@ -833,8 +1826,1301 @@
         </w:rPr>
         <w:t>Anti-windup</w:t>
       </w:r>
-      <w:r>
-        <w:t xml:space="preserve"> (Clamping), el integrador no se satura durante la fase de aceleración inicial, garantizando que la válvula se abra al máximo permitido solo durante el tiempo estrictamente necesario.</w:t>
+      <w:proofErr w:type="spellEnd"/>
+      <w:r>
+        <w:t xml:space="preserve"> (</w:t>
+      </w:r>
+      <w:proofErr w:type="spellStart"/>
+      <w:r>
+        <w:t>Clamping</w:t>
+      </w:r>
+      <w:proofErr w:type="spellEnd"/>
+      <w:r>
+        <w:t>), el integrador no se satura durante la fase de aceleración inicial, garantizando que la válvula se abra al máximo permitido solo durante el tiempo estrictamente necesario.</w:t>
+      </w:r>
+    </w:p>
+    <w:p>
+      <w:pPr>
+        <w:keepNext/>
+        <w:spacing w:after="0" w:afterAutospacing="0"/>
+        <w:jc w:val="center"/>
+      </w:pPr>
+      <w:r>
+        <w:drawing>
+          <wp:inline distT="0" distB="0" distL="0" distR="0" wp14:anchorId="0C43BCD2" wp14:editId="6302142F">
+            <wp:extent cx="6645910" cy="3447415"/>
+            <wp:effectExtent l="19050" t="19050" r="21590" b="19685"/>
+            <wp:docPr id="743721989" name="Imagen 1"/>
+            <wp:cNvGraphicFramePr>
+              <a:graphicFrameLocks xmlns:a="http://schemas.openxmlformats.org/drawingml/2006/main" noChangeAspect="1"/>
+            </wp:cNvGraphicFramePr>
+            <a:graphic xmlns:a="http://schemas.openxmlformats.org/drawingml/2006/main">
+              <a:graphicData uri="http://schemas.openxmlformats.org/drawingml/2006/picture">
+                <pic:pic xmlns:pic="http://schemas.openxmlformats.org/drawingml/2006/picture">
+                  <pic:nvPicPr>
+                    <pic:cNvPr id="743721989" name=""/>
+                    <pic:cNvPicPr/>
+                  </pic:nvPicPr>
+                  <pic:blipFill>
+                    <a:blip r:embed="rId11"/>
+                    <a:stretch>
+                      <a:fillRect/>
+                    </a:stretch>
+                  </pic:blipFill>
+                  <pic:spPr>
+                    <a:xfrm>
+                      <a:off x="0" y="0"/>
+                      <a:ext cx="6645910" cy="3447415"/>
+                    </a:xfrm>
+                    <a:prstGeom prst="rect">
+                      <a:avLst/>
+                    </a:prstGeom>
+                    <a:ln>
+                      <a:solidFill>
+                        <a:schemeClr val="tx1"/>
+                      </a:solidFill>
+                    </a:ln>
+                  </pic:spPr>
+                </pic:pic>
+              </a:graphicData>
+            </a:graphic>
+          </wp:inline>
+        </w:drawing>
+      </w:r>
+    </w:p>
+    <w:p>
+      <w:pPr>
+        <w:pStyle w:val="Descripcin"/>
+        <w:jc w:val="center"/>
+      </w:pPr>
+      <w:r>
+        <w:t xml:space="preserve">Figura </w:t>
+      </w:r>
+      <w:r>
+        <w:fldChar w:fldCharType="begin"/>
+      </w:r>
+      <w:r>
+        <w:instrText xml:space="preserve"> SEQ Figura \* ARABIC </w:instrText>
+      </w:r>
+      <w:r>
+        <w:fldChar w:fldCharType="separate"/>
+      </w:r>
+      <w:r>
+        <w:rPr>
+          <w:noProof/>
+        </w:rPr>
+        <w:t>3</w:t>
+      </w:r>
+      <w:r>
+        <w:fldChar w:fldCharType="end"/>
+      </w:r>
+      <w:r>
+        <w:t>. Sintonización y adecuación del PID</w:t>
+      </w:r>
+    </w:p>
+    <w:p>
+      <w:pPr>
+        <w:keepNext/>
+        <w:spacing w:after="0" w:afterAutospacing="0"/>
+        <w:jc w:val="center"/>
+      </w:pPr>
+      <w:r>
+        <w:drawing>
+          <wp:inline distT="0" distB="0" distL="0" distR="0" wp14:anchorId="1397B2E8" wp14:editId="0476486D">
+            <wp:extent cx="5395011" cy="2608843"/>
+            <wp:effectExtent l="19050" t="19050" r="15240" b="20320"/>
+            <wp:docPr id="1620197427" name="Imagen 1"/>
+            <wp:cNvGraphicFramePr>
+              <a:graphicFrameLocks xmlns:a="http://schemas.openxmlformats.org/drawingml/2006/main" noChangeAspect="1"/>
+            </wp:cNvGraphicFramePr>
+            <a:graphic xmlns:a="http://schemas.openxmlformats.org/drawingml/2006/main">
+              <a:graphicData uri="http://schemas.openxmlformats.org/drawingml/2006/picture">
+                <pic:pic xmlns:pic="http://schemas.openxmlformats.org/drawingml/2006/picture">
+                  <pic:nvPicPr>
+                    <pic:cNvPr id="1620197427" name=""/>
+                    <pic:cNvPicPr/>
+                  </pic:nvPicPr>
+                  <pic:blipFill>
+                    <a:blip r:embed="rId12"/>
+                    <a:stretch>
+                      <a:fillRect/>
+                    </a:stretch>
+                  </pic:blipFill>
+                  <pic:spPr>
+                    <a:xfrm>
+                      <a:off x="0" y="0"/>
+                      <a:ext cx="5413666" cy="2617864"/>
+                    </a:xfrm>
+                    <a:prstGeom prst="rect">
+                      <a:avLst/>
+                    </a:prstGeom>
+                    <a:ln>
+                      <a:solidFill>
+                        <a:schemeClr val="tx1"/>
+                      </a:solidFill>
+                    </a:ln>
+                  </pic:spPr>
+                </pic:pic>
+              </a:graphicData>
+            </a:graphic>
+          </wp:inline>
+        </w:drawing>
+      </w:r>
+    </w:p>
+    <w:p>
+      <w:pPr>
+        <w:pStyle w:val="Descripcin"/>
+        <w:jc w:val="center"/>
+      </w:pPr>
+      <w:r>
+        <w:t xml:space="preserve">Figura </w:t>
+      </w:r>
+      <w:r>
+        <w:fldChar w:fldCharType="begin"/>
+      </w:r>
+      <w:r>
+        <w:instrText xml:space="preserve"> SEQ Figura \* ARABIC </w:instrText>
+      </w:r>
+      <w:r>
+        <w:fldChar w:fldCharType="separate"/>
+      </w:r>
+      <w:r>
+        <w:rPr>
+          <w:noProof/>
+        </w:rPr>
+        <w:t>4</w:t>
+      </w:r>
+      <w:r>
+        <w:fldChar w:fldCharType="end"/>
+      </w:r>
+      <w:r>
+        <w:t>. Respuesta del sistema con el PID sintonizado</w:t>
+      </w:r>
+    </w:p>
+    <w:p>
+      <w:pPr>
+        <w:pStyle w:val="Ttulo2"/>
+      </w:pPr>
+      <w:bookmarkStart w:id="3" w:name="_Toc224668010"/>
+      <w:r>
+        <w:t>2.2. Modelado del Entorno Real (Fidelidad del Gemelo Digital)</w:t>
+      </w:r>
+      <w:bookmarkEnd w:id="3"/>
+    </w:p>
+    <w:p>
+      <w:r>
+        <w:t>Para que el modelo no sea una simulación ideal, se ha dotado al sistema de una arquitectura de alta fidelidad que reproduce las condiciones físicas y ambientales de un vuelo real. Este apartado detalla los elementos de realismo inyectados en el modelo.</w:t>
+      </w:r>
+    </w:p>
+    <w:p>
+      <w:pPr>
+        <w:pStyle w:val="Ttulo3"/>
+        <w:spacing w:afterAutospacing="0"/>
+      </w:pPr>
+      <w:bookmarkStart w:id="4" w:name="_Toc224668011"/>
+      <w:r>
+        <w:t>2.2.1. Dinámica del Actuador y Respuesta Térmica</w:t>
+      </w:r>
+      <w:bookmarkEnd w:id="4"/>
+    </w:p>
+    <w:p>
+      <w:r>
+        <w:t>Se ha integrado una función de transferencia de primer orden (</w:t>
+      </w:r>
+      <m:oMath>
+        <m:f>
+          <m:fPr>
+            <m:ctrlPr>
+              <w:rPr>
+                <w:rFonts w:ascii="Cambria Math" w:hAnsi="Cambria Math"/>
+              </w:rPr>
+            </m:ctrlPr>
+          </m:fPr>
+          <m:num>
+            <m:r>
+              <w:rPr>
+                <w:rFonts w:ascii="Cambria Math" w:hAnsi="Cambria Math"/>
+              </w:rPr>
+              <m:t>1</m:t>
+            </m:r>
+            <m:ctrlPr>
+              <w:rPr>
+                <w:rFonts w:ascii="Cambria Math" w:hAnsi="Cambria Math"/>
+                <w:i/>
+              </w:rPr>
+            </m:ctrlPr>
+          </m:num>
+          <m:den>
+            <m:r>
+              <w:rPr>
+                <w:rFonts w:ascii="Cambria Math" w:hAnsi="Cambria Math"/>
+              </w:rPr>
+              <m:t>0.5s+1</m:t>
+            </m:r>
+            <m:ctrlPr>
+              <w:rPr>
+                <w:rFonts w:ascii="Cambria Math" w:hAnsi="Cambria Math"/>
+                <w:i/>
+              </w:rPr>
+            </m:ctrlPr>
+          </m:den>
+        </m:f>
+      </m:oMath>
+      <w:r>
+        <w:t>) entre el controlador FADEC y la turbina. Esto modela la inercia mecánica de la válvula de combustible y el retardo térmico de la cámara de combustión.</w:t>
+      </w:r>
+    </w:p>
+    <w:p>
+      <w:pPr>
+        <w:numPr>
+          <w:ilvl w:val="0"/>
+          <w:numId w:val="11"/>
+        </w:numPr>
+      </w:pPr>
+      <w:r>
+        <w:rPr>
+          <w:b/>
+          <w:bCs/>
+        </w:rPr>
+        <w:t>Propósito:</w:t>
+      </w:r>
+      <w:r>
+        <w:t xml:space="preserve"> Evitar respuestas instantáneas físicamente imposibles y obligar al PID a gestionar un sistema con retardo</w:t>
+      </w:r>
+      <w:r>
+        <w:t>.</w:t>
+      </w:r>
+    </w:p>
+    <w:p>
+      <w:pPr>
+        <w:pStyle w:val="Ttulo3"/>
+        <w:spacing w:before="0" w:afterAutospacing="0"/>
+      </w:pPr>
+      <w:bookmarkStart w:id="5" w:name="_Toc224668012"/>
+      <w:r>
+        <w:t>2.2.2. Turbulencia Atmosférica Estocástica (Mach Variable)</w:t>
+      </w:r>
+      <w:bookmarkEnd w:id="5"/>
+    </w:p>
+    <w:p>
+      <w:r>
+        <w:t>En lugar de un Número de Mach estático, el motor se ha expuesto a un flujo de aire variable. Utilizando un generador de ruido aleatorio filtrado, se simula la turbulencia de pequeña escala.</w:t>
+      </w:r>
+    </w:p>
+    <w:p>
+      <w:pPr>
+        <w:numPr>
+          <w:ilvl w:val="0"/>
+          <w:numId w:val="12"/>
+        </w:numPr>
+      </w:pPr>
+      <w:r>
+        <w:rPr>
+          <w:b/>
+          <w:bCs/>
+        </w:rPr>
+        <w:t>Efecto:</w:t>
+      </w:r>
+      <w:r>
+        <w:t xml:space="preserve"> El sistema experimenta variaciones continuas en la presión dinámica de entrada, obligando al PID a realizar </w:t>
+      </w:r>
+      <w:proofErr w:type="spellStart"/>
+      <w:r>
+        <w:t>micro-ajustes</w:t>
+      </w:r>
+      <w:proofErr w:type="spellEnd"/>
+      <w:r>
+        <w:t xml:space="preserve"> permanentes en el </w:t>
+      </w:r>
+      <w:r>
+        <w:rPr>
+          <w:i/>
+          <w:iCs/>
+        </w:rPr>
+        <w:t>throttle</w:t>
+      </w:r>
+      <w:r>
+        <w:t xml:space="preserve"> para estabilizar el empuje.</w:t>
+      </w:r>
+    </w:p>
+    <w:p>
+      <w:pPr>
+        <w:pStyle w:val="Ttulo3"/>
+      </w:pPr>
+      <w:r>
+        <w:t>2.2.3. Estabilidad en Atmósfera No Perturbada (Altitud Dinámica)</w:t>
+      </w:r>
+    </w:p>
+    <w:p>
+      <w:r>
+        <w:t>Se ha modelado la altitud combinando una base estática (10.000 m) con una componente senoidal de baja frecuencia. Esto representa las corrientes térmicas y ondas de montaña que provocan cambios sutiles en la densidad del aire.</w:t>
+      </w:r>
+    </w:p>
+    <w:p>
+      <w:pPr>
+        <w:numPr>
+          <w:ilvl w:val="0"/>
+          <w:numId w:val="13"/>
+        </w:numPr>
+      </w:pPr>
+      <w:r>
+        <w:rPr>
+          <w:b/>
+          <w:bCs/>
+        </w:rPr>
+        <w:t>Resultado:</w:t>
+      </w:r>
+      <w:r>
+        <w:t xml:space="preserve"> El controlador demuestra su capacidad de seguimiento dinámico, compensando los cambios de densidad para mantener los 8.000 N constantes.</w:t>
+      </w:r>
+    </w:p>
+    <w:p>
+      <w:pPr>
+        <w:pStyle w:val="Ttulo3"/>
+        <w:spacing w:afterAutospacing="0"/>
+      </w:pPr>
+      <w:r>
+        <w:t>2.2.4. Digitalización y Ruido de Medida (ADC/Sensores)</w:t>
+      </w:r>
+    </w:p>
+    <w:p>
+      <w:r>
+        <w:t xml:space="preserve">Para cerrar el bucle, se ha simulado la cadena de adquisición de datos mediante un bloque </w:t>
+      </w:r>
+      <w:r>
+        <w:rPr>
+          <w:i/>
+          <w:iCs/>
+        </w:rPr>
+        <w:t>Zero-</w:t>
+      </w:r>
+      <w:proofErr w:type="spellStart"/>
+      <w:r>
+        <w:rPr>
+          <w:i/>
+          <w:iCs/>
+        </w:rPr>
+        <w:t>Order</w:t>
+      </w:r>
+      <w:proofErr w:type="spellEnd"/>
+      <w:r>
+        <w:rPr>
+          <w:i/>
+          <w:iCs/>
+        </w:rPr>
+        <w:t xml:space="preserve"> Hold</w:t>
+      </w:r>
+      <w:r>
+        <w:t xml:space="preserve"> (muestreo a 0.01s) y la inyección de </w:t>
+      </w:r>
+      <w:r>
+        <w:rPr>
+          <w:b/>
+          <w:bCs/>
+        </w:rPr>
+        <w:t>ruido blanco</w:t>
+      </w:r>
+      <w:r>
+        <w:t xml:space="preserve"> en la señal de empuje.</w:t>
+      </w:r>
+    </w:p>
+    <w:p>
+      <w:pPr>
+        <w:numPr>
+          <w:ilvl w:val="0"/>
+          <w:numId w:val="14"/>
+        </w:numPr>
+      </w:pPr>
+      <w:r>
+        <w:rPr>
+          <w:b/>
+          <w:bCs/>
+        </w:rPr>
+        <w:t>Validación:</w:t>
+      </w:r>
+      <w:r>
+        <w:t xml:space="preserve"> Esto garantiza que el algoritmo PID es robusto frente a las vibraciones del sensor y que no amplifica el ruido de alta frecuencia hacia el actuador.</w:t>
+      </w:r>
+    </w:p>
+    <w:p>
+      <w:pPr>
+        <w:keepNext/>
+        <w:spacing w:after="0" w:afterAutospacing="0"/>
+        <w:jc w:val="center"/>
+      </w:pPr>
+      <w:r>
+        <w:rPr>
+          <w:noProof/>
+        </w:rPr>
+        <w:drawing>
+          <wp:inline distT="0" distB="0" distL="0" distR="0" wp14:anchorId="56DE8783" wp14:editId="6F77C79F">
+            <wp:extent cx="6552631" cy="3179953"/>
+            <wp:effectExtent l="19050" t="19050" r="19685" b="20955"/>
+            <wp:docPr id="1824623544" name="Imagen 2"/>
+            <wp:cNvGraphicFramePr>
+              <a:graphicFrameLocks xmlns:a="http://schemas.openxmlformats.org/drawingml/2006/main" noChangeAspect="1"/>
+            </wp:cNvGraphicFramePr>
+            <a:graphic xmlns:a="http://schemas.openxmlformats.org/drawingml/2006/main">
+              <a:graphicData uri="http://schemas.openxmlformats.org/drawingml/2006/picture">
+                <pic:pic xmlns:pic="http://schemas.openxmlformats.org/drawingml/2006/picture">
+                  <pic:nvPicPr>
+                    <pic:cNvPr id="0" name="Picture 2"/>
+                    <pic:cNvPicPr>
+                      <a:picLocks noChangeAspect="1" noChangeArrowheads="1"/>
+                    </pic:cNvPicPr>
+                  </pic:nvPicPr>
+                  <pic:blipFill>
+                    <a:blip r:embed="rId13">
+                      <a:extLst>
+                        <a:ext uri="{28A0092B-C50C-407E-A947-70E740481C1C}">
+                          <a14:useLocalDpi xmlns:a14="http://schemas.microsoft.com/office/drawing/2010/main" val="0"/>
+                        </a:ext>
+                      </a:extLst>
+                    </a:blip>
+                    <a:srcRect/>
+                    <a:stretch>
+                      <a:fillRect/>
+                    </a:stretch>
+                  </pic:blipFill>
+                  <pic:spPr bwMode="auto">
+                    <a:xfrm>
+                      <a:off x="0" y="0"/>
+                      <a:ext cx="6577461" cy="3192003"/>
+                    </a:xfrm>
+                    <a:prstGeom prst="rect">
+                      <a:avLst/>
+                    </a:prstGeom>
+                    <a:noFill/>
+                    <a:ln>
+                      <a:solidFill>
+                        <a:schemeClr val="tx1"/>
+                      </a:solidFill>
+                    </a:ln>
+                  </pic:spPr>
+                </pic:pic>
+              </a:graphicData>
+            </a:graphic>
+          </wp:inline>
+        </w:drawing>
+      </w:r>
+    </w:p>
+    <w:p>
+      <w:pPr>
+        <w:pStyle w:val="Descripcin"/>
+        <w:jc w:val="center"/>
+      </w:pPr>
+      <w:r>
+        <w:t xml:space="preserve">Figura </w:t>
+      </w:r>
+      <w:r>
+        <w:fldChar w:fldCharType="begin"/>
+      </w:r>
+      <w:r>
+        <w:instrText xml:space="preserve"> SEQ Figura \* ARABIC </w:instrText>
+      </w:r>
+      <w:r>
+        <w:fldChar w:fldCharType="separate"/>
+      </w:r>
+      <w:r>
+        <w:rPr>
+          <w:noProof/>
+        </w:rPr>
+        <w:t>5</w:t>
+      </w:r>
+      <w:r>
+        <w:fldChar w:fldCharType="end"/>
+      </w:r>
+      <w:r>
+        <w:t>. Planta con perturbaciones añadidas</w:t>
+      </w:r>
+    </w:p>
+    <w:p>
+      <w:pPr>
+        <w:pStyle w:val="Ttulo1"/>
+        <w:spacing w:afterAutospacing="0"/>
+      </w:pPr>
+      <w:bookmarkStart w:id="6" w:name="_Toc224668013"/>
+      <w:r>
+        <w:t>3. Arquitectura del Sistema: Subsistemas y Enmascaramiento</w:t>
+      </w:r>
+      <w:bookmarkEnd w:id="6"/>
+    </w:p>
+    <w:p>
+      <w:r>
+        <w:t xml:space="preserve">Para gestionar la complejidad del Gemelo Digital y facilitar su portabilidad a sistemas reales, el modelo se ha estructurado en dos bloques funcionales independientes: la </w:t>
+      </w:r>
+      <w:r>
+        <w:rPr>
+          <w:b/>
+          <w:bCs/>
+        </w:rPr>
+        <w:t xml:space="preserve">Unidad de Control </w:t>
+      </w:r>
+      <w:r>
+        <w:t xml:space="preserve">y la </w:t>
+      </w:r>
+      <w:r>
+        <w:rPr>
+          <w:b/>
+          <w:bCs/>
+        </w:rPr>
+        <w:t>Planta Propulsiva (Turbofán)</w:t>
+      </w:r>
+      <w:r>
+        <w:t>.</w:t>
+      </w:r>
+    </w:p>
+    <w:p>
+      <w:pPr>
+        <w:pStyle w:val="Ttulo2"/>
+        <w:spacing w:afterAutospacing="0"/>
+      </w:pPr>
+      <w:bookmarkStart w:id="7" w:name="_Toc224668014"/>
+      <w:r>
+        <w:t>3.1. Segmentación de Componentes</w:t>
+      </w:r>
+      <w:bookmarkEnd w:id="7"/>
+    </w:p>
+    <w:p>
+      <w:r>
+        <w:t>Se han creado dos subsistemas diferenciados para separar el software del hardware:</w:t>
+      </w:r>
+    </w:p>
+    <w:p>
+      <w:pPr>
+        <w:numPr>
+          <w:ilvl w:val="0"/>
+          <w:numId w:val="15"/>
+        </w:numPr>
+      </w:pPr>
+      <w:r>
+        <w:rPr>
+          <w:b/>
+          <w:bCs/>
+        </w:rPr>
+        <w:t>Subsistema de Control:</w:t>
+      </w:r>
+      <w:r>
+        <w:t xml:space="preserve"> Encapsula el algoritmo PID discreto</w:t>
+      </w:r>
+      <w:r>
+        <w:t xml:space="preserve"> </w:t>
+      </w:r>
+      <w:r>
+        <w:t>y la dinámica del actuador. Es el bloque que se derivará el código C++ final.</w:t>
+      </w:r>
+    </w:p>
+    <w:p>
+      <w:pPr>
+        <w:numPr>
+          <w:ilvl w:val="0"/>
+          <w:numId w:val="15"/>
+        </w:numPr>
+      </w:pPr>
+      <w:r>
+        <w:rPr>
+          <w:b/>
+          <w:bCs/>
+        </w:rPr>
+        <w:t>Subsistema de Planta y Entorno:</w:t>
+      </w:r>
+      <w:r>
+        <w:t xml:space="preserve"> Este bloque agrupa el modelo termodinámico de la turbina junto con todas las fuentes de perturbación implementadas (ruido de sensores, variaciones de Mach estocásticas y rampas de altitud). Al estar separado, permite testear el mismo controlador bajo diferentes condiciones ambientales sin modificar el algoritmo.</w:t>
+      </w:r>
+    </w:p>
+    <w:p>
+      <w:pPr>
+        <w:keepNext/>
+        <w:spacing w:after="0" w:afterAutospacing="0"/>
+      </w:pPr>
+      <w:r>
+        <w:drawing>
+          <wp:inline distT="0" distB="0" distL="0" distR="0" wp14:anchorId="7F40B7F2" wp14:editId="575809AF">
+            <wp:extent cx="6645910" cy="3364865"/>
+            <wp:effectExtent l="0" t="0" r="2540" b="6985"/>
+            <wp:docPr id="473423019" name="Imagen 1"/>
+            <wp:cNvGraphicFramePr>
+              <a:graphicFrameLocks xmlns:a="http://schemas.openxmlformats.org/drawingml/2006/main" noChangeAspect="1"/>
+            </wp:cNvGraphicFramePr>
+            <a:graphic xmlns:a="http://schemas.openxmlformats.org/drawingml/2006/main">
+              <a:graphicData uri="http://schemas.openxmlformats.org/drawingml/2006/picture">
+                <pic:pic xmlns:pic="http://schemas.openxmlformats.org/drawingml/2006/picture">
+                  <pic:nvPicPr>
+                    <pic:cNvPr id="473423019" name=""/>
+                    <pic:cNvPicPr/>
+                  </pic:nvPicPr>
+                  <pic:blipFill>
+                    <a:blip r:embed="rId14"/>
+                    <a:stretch>
+                      <a:fillRect/>
+                    </a:stretch>
+                  </pic:blipFill>
+                  <pic:spPr>
+                    <a:xfrm>
+                      <a:off x="0" y="0"/>
+                      <a:ext cx="6645910" cy="3364865"/>
+                    </a:xfrm>
+                    <a:prstGeom prst="rect">
+                      <a:avLst/>
+                    </a:prstGeom>
+                  </pic:spPr>
+                </pic:pic>
+              </a:graphicData>
+            </a:graphic>
+          </wp:inline>
+        </w:drawing>
+      </w:r>
+    </w:p>
+    <w:p>
+      <w:pPr>
+        <w:pStyle w:val="Descripcin"/>
+        <w:jc w:val="center"/>
+      </w:pPr>
+      <w:r>
+        <w:t xml:space="preserve">Figura </w:t>
+      </w:r>
+      <w:r>
+        <w:fldChar w:fldCharType="begin"/>
+      </w:r>
+      <w:r>
+        <w:instrText xml:space="preserve"> SEQ Figura \* ARABIC </w:instrText>
+      </w:r>
+      <w:r>
+        <w:fldChar w:fldCharType="separate"/>
+      </w:r>
+      <w:r>
+        <w:rPr>
+          <w:noProof/>
+        </w:rPr>
+        <w:t>6</w:t>
+      </w:r>
+      <w:r>
+        <w:fldChar w:fldCharType="end"/>
+      </w:r>
+      <w:r>
+        <w:t>. Planta dividida en submódulos</w:t>
+      </w:r>
+    </w:p>
+    <w:p>
+      <w:pPr>
+        <w:pStyle w:val="Ttulo2"/>
+        <w:spacing w:afterAutospacing="0"/>
+      </w:pPr>
+      <w:bookmarkStart w:id="8" w:name="_Toc224668015"/>
+      <w:r>
+        <w:t>3.2. Diseño de la Máscara de Control</w:t>
+      </w:r>
+      <w:bookmarkEnd w:id="8"/>
+    </w:p>
+    <w:p>
+      <w:r>
+        <w:t xml:space="preserve">Se ha diseñado una </w:t>
+      </w:r>
+      <w:r>
+        <w:rPr>
+          <w:b/>
+          <w:bCs/>
+        </w:rPr>
+        <w:t>interfaz de usuario personalizada (Mask)</w:t>
+      </w:r>
+      <w:r>
+        <w:t xml:space="preserve"> para el bloque del controlador. Esta capa de abstracción permite interactuar con el modelo de forma segura y eficiente:</w:t>
+      </w:r>
+    </w:p>
+    <w:p>
+      <w:pPr>
+        <w:numPr>
+          <w:ilvl w:val="0"/>
+          <w:numId w:val="16"/>
+        </w:numPr>
+      </w:pPr>
+      <w:r>
+        <w:rPr>
+          <w:b/>
+          <w:bCs/>
+        </w:rPr>
+        <w:t>Parametrización Dinámica:</w:t>
+      </w:r>
+      <w:r>
+        <w:t xml:space="preserve"> A través del menú de la máscara, se han vinculado las variables internas del bloque PID (</w:t>
+      </w:r>
+      <m:oMath>
+        <m:sSub>
+          <m:sSubPr>
+            <m:ctrlPr>
+              <w:rPr>
+                <w:rFonts w:ascii="Cambria Math" w:hAnsi="Cambria Math"/>
+                <w:i/>
+              </w:rPr>
+            </m:ctrlPr>
+          </m:sSubPr>
+          <m:e>
+            <m:r>
+              <w:rPr>
+                <w:rFonts w:ascii="Cambria Math" w:hAnsi="Cambria Math"/>
+              </w:rPr>
+              <m:t>K</m:t>
+            </m:r>
+          </m:e>
+          <m:sub>
+            <m:r>
+              <w:rPr>
+                <w:rFonts w:ascii="Cambria Math" w:hAnsi="Cambria Math"/>
+              </w:rPr>
+              <m:t>p</m:t>
+            </m:r>
+          </m:sub>
+        </m:sSub>
+        <m:r>
+          <w:rPr>
+            <w:rFonts w:ascii="Cambria Math" w:hAnsi="Cambria Math"/>
+          </w:rPr>
+          <m:t>,</m:t>
+        </m:r>
+        <m:sSub>
+          <m:sSubPr>
+            <m:ctrlPr>
+              <w:rPr>
+                <w:rFonts w:ascii="Cambria Math" w:hAnsi="Cambria Math"/>
+                <w:i/>
+              </w:rPr>
+            </m:ctrlPr>
+          </m:sSubPr>
+          <m:e>
+            <m:r>
+              <w:rPr>
+                <w:rFonts w:ascii="Cambria Math" w:hAnsi="Cambria Math"/>
+              </w:rPr>
+              <m:t>K</m:t>
+            </m:r>
+          </m:e>
+          <m:sub>
+            <m:r>
+              <w:rPr>
+                <w:rFonts w:ascii="Cambria Math" w:hAnsi="Cambria Math"/>
+              </w:rPr>
+              <m:t>i</m:t>
+            </m:r>
+          </m:sub>
+        </m:sSub>
+        <m:r>
+          <w:rPr>
+            <w:rFonts w:ascii="Cambria Math" w:hAnsi="Cambria Math"/>
+          </w:rPr>
+          <m:t>,</m:t>
+        </m:r>
+        <m:sSub>
+          <m:sSubPr>
+            <m:ctrlPr>
+              <w:rPr>
+                <w:rFonts w:ascii="Cambria Math" w:hAnsi="Cambria Math"/>
+                <w:i/>
+              </w:rPr>
+            </m:ctrlPr>
+          </m:sSubPr>
+          <m:e>
+            <m:r>
+              <w:rPr>
+                <w:rFonts w:ascii="Cambria Math" w:hAnsi="Cambria Math"/>
+              </w:rPr>
+              <m:t>K</m:t>
+            </m:r>
+          </m:e>
+          <m:sub>
+            <m:r>
+              <w:rPr>
+                <w:rFonts w:ascii="Cambria Math" w:hAnsi="Cambria Math"/>
+              </w:rPr>
+              <m:t>d</m:t>
+            </m:r>
+          </m:sub>
+        </m:sSub>
+      </m:oMath>
+      <w:r>
+        <w:t>) y de la inercia del actuador (</w:t>
+      </w:r>
+      <m:oMath>
+        <m:r>
+          <m:rPr>
+            <m:sty m:val="p"/>
+          </m:rPr>
+          <w:rPr>
+            <w:rFonts w:ascii="Cambria Math" w:hAnsi="Cambria Math"/>
+          </w:rPr>
+          <m:t>τ</m:t>
+        </m:r>
+      </m:oMath>
+      <w:r>
+        <w:t>) con parámetros externos.</w:t>
+      </w:r>
+    </w:p>
+    <w:p>
+      <w:pPr>
+        <w:numPr>
+          <w:ilvl w:val="0"/>
+          <w:numId w:val="16"/>
+        </w:numPr>
+      </w:pPr>
+      <w:r>
+        <w:rPr>
+          <w:b/>
+          <w:bCs/>
+        </w:rPr>
+        <w:t>Ventajas</w:t>
+      </w:r>
+      <w:r>
+        <w:rPr>
+          <w:b/>
+          <w:bCs/>
+        </w:rPr>
+        <w:t xml:space="preserve">: </w:t>
+      </w:r>
+      <w:r>
+        <w:t>Esto permite realizar el sintonizado de ganancias y pruebas de sensibilidad sin necesidad de acceder al esquema interno de bloques. Además, garantiza que cualquier cambio en la máscara se actualice automáticamente en todos los componentes internos vinculados, reduciendo el riesgo de errores de configuración.</w:t>
+      </w:r>
+    </w:p>
+    <w:p>
+      <w:pPr>
+        <w:pStyle w:val="Ttulo2"/>
+        <w:spacing w:afterAutospacing="0"/>
+      </w:pPr>
+      <w:bookmarkStart w:id="9" w:name="_Toc224668016"/>
+      <w:r>
+        <w:t>3.3. Interfaz de Señales</w:t>
+      </w:r>
+      <w:bookmarkEnd w:id="9"/>
+    </w:p>
+    <w:p>
+      <w:r>
+        <w:t>El diseño se ha completado definiendo puertos de entrada y salida normalizados. El controlador recibe las referencias de empuje y las señales de los sensores, mientras que la planta procesa el caudal de combustible calculado y devuelve el empuje real, cerrando así el lazo de control de forma modular.</w:t>
+      </w:r>
+    </w:p>
+    <w:p>
+      <w:pPr>
+        <w:keepNext/>
+        <w:spacing w:after="0" w:afterAutospacing="0"/>
+        <w:jc w:val="center"/>
+      </w:pPr>
+      <w:r>
+        <w:drawing>
+          <wp:inline distT="0" distB="0" distL="0" distR="0" wp14:anchorId="3AEB4E1D" wp14:editId="5A9138FA">
+            <wp:extent cx="4614757" cy="2589132"/>
+            <wp:effectExtent l="0" t="0" r="0" b="1905"/>
+            <wp:docPr id="170620015" name="Imagen 1"/>
+            <wp:cNvGraphicFramePr>
+              <a:graphicFrameLocks xmlns:a="http://schemas.openxmlformats.org/drawingml/2006/main" noChangeAspect="1"/>
+            </wp:cNvGraphicFramePr>
+            <a:graphic xmlns:a="http://schemas.openxmlformats.org/drawingml/2006/main">
+              <a:graphicData uri="http://schemas.openxmlformats.org/drawingml/2006/picture">
+                <pic:pic xmlns:pic="http://schemas.openxmlformats.org/drawingml/2006/picture">
+                  <pic:nvPicPr>
+                    <pic:cNvPr id="170620015" name=""/>
+                    <pic:cNvPicPr/>
+                  </pic:nvPicPr>
+                  <pic:blipFill>
+                    <a:blip r:embed="rId15"/>
+                    <a:stretch>
+                      <a:fillRect/>
+                    </a:stretch>
+                  </pic:blipFill>
+                  <pic:spPr>
+                    <a:xfrm>
+                      <a:off x="0" y="0"/>
+                      <a:ext cx="4630561" cy="2597999"/>
+                    </a:xfrm>
+                    <a:prstGeom prst="rect">
+                      <a:avLst/>
+                    </a:prstGeom>
+                  </pic:spPr>
+                </pic:pic>
+              </a:graphicData>
+            </a:graphic>
+          </wp:inline>
+        </w:drawing>
+      </w:r>
+    </w:p>
+    <w:p>
+      <w:pPr>
+        <w:pStyle w:val="Descripcin"/>
+        <w:jc w:val="center"/>
+      </w:pPr>
+      <w:r>
+        <w:t xml:space="preserve">Figura </w:t>
+      </w:r>
+      <w:r>
+        <w:fldChar w:fldCharType="begin"/>
+      </w:r>
+      <w:r>
+        <w:instrText xml:space="preserve"> SEQ Figura \* ARABIC </w:instrText>
+      </w:r>
+      <w:r>
+        <w:fldChar w:fldCharType="separate"/>
+      </w:r>
+      <w:r>
+        <w:rPr>
+          <w:noProof/>
+        </w:rPr>
+        <w:t>7</w:t>
+      </w:r>
+      <w:r>
+        <w:fldChar w:fldCharType="end"/>
+      </w:r>
+      <w:r>
+        <w:t>. Máscara creada en el controlador</w:t>
+      </w:r>
+    </w:p>
+    <w:p>
+      <w:pPr>
+        <w:pStyle w:val="Ttulo1"/>
+        <w:spacing w:afterAutospacing="0"/>
+      </w:pPr>
+      <w:r>
+        <w:t>4. Generación de Código y Validación (Software-in-</w:t>
+      </w:r>
+      <w:proofErr w:type="spellStart"/>
+      <w:r>
+        <w:t>the</w:t>
+      </w:r>
+      <w:proofErr w:type="spellEnd"/>
+      <w:r>
+        <w:t>-Loop)</w:t>
+      </w:r>
+    </w:p>
+    <w:p>
+      <w:r>
+        <w:t xml:space="preserve">Una vez validado el comportamiento del </w:t>
+      </w:r>
+      <w:r>
+        <w:rPr>
+          <w:b/>
+          <w:bCs/>
+        </w:rPr>
+        <w:t>Gemelo Digital</w:t>
+      </w:r>
+      <w:r>
+        <w:t xml:space="preserve"> en el entorno de simulación, el paso final consiste en transformar el modelo gráfico del controlador en un algoritmo ejecutable en lenguaje C++. Este proceso es fundamental para garantizar que la lógica de control diseñada sea portadora a una </w:t>
+      </w:r>
+      <w:r>
+        <w:rPr>
+          <w:b/>
+          <w:bCs/>
+        </w:rPr>
+        <w:t xml:space="preserve">ECU </w:t>
+      </w:r>
+      <w:r>
+        <w:t>real o a un entorno de pruebas de alta fidelidad fuera de Simulink.</w:t>
+      </w:r>
+    </w:p>
+    <w:p>
+      <w:pPr>
+        <w:pStyle w:val="Ttulo2"/>
+        <w:spacing w:afterAutospacing="0"/>
+      </w:pPr>
+      <w:r>
+        <w:t>4.1. Procedimiento de Configuración y Compilación</w:t>
+      </w:r>
+    </w:p>
+    <w:p>
+      <w:r>
+        <w:t>Para realizar la transición de bloques a código fuente, se ha seguido un flujo de trabajo estándar de ingeniería rápida, asegurando que el software resultante sea determinista y eficiente:</w:t>
+      </w:r>
+    </w:p>
+    <w:p>
+      <w:pPr>
+        <w:numPr>
+          <w:ilvl w:val="0"/>
+          <w:numId w:val="19"/>
+        </w:numPr>
+      </w:pPr>
+      <w:r>
+        <w:rPr>
+          <w:b/>
+          <w:bCs/>
+        </w:rPr>
+        <w:t xml:space="preserve">Ajuste del </w:t>
+      </w:r>
+      <w:proofErr w:type="spellStart"/>
+      <w:r>
+        <w:rPr>
+          <w:b/>
+          <w:bCs/>
+        </w:rPr>
+        <w:t>Solver</w:t>
+      </w:r>
+      <w:proofErr w:type="spellEnd"/>
+      <w:r>
+        <w:rPr>
+          <w:b/>
+          <w:bCs/>
+        </w:rPr>
+        <w:t xml:space="preserve"> (Tiempo Real):</w:t>
+      </w:r>
+      <w:r>
+        <w:t xml:space="preserve"> En el menú de </w:t>
+      </w:r>
+      <w:r>
+        <w:rPr>
+          <w:i/>
+          <w:iCs/>
+        </w:rPr>
+        <w:t xml:space="preserve">Model </w:t>
+      </w:r>
+      <w:proofErr w:type="spellStart"/>
+      <w:r>
+        <w:rPr>
+          <w:i/>
+          <w:iCs/>
+        </w:rPr>
+        <w:t>Settings</w:t>
+      </w:r>
+      <w:proofErr w:type="spellEnd"/>
+      <w:r>
+        <w:t xml:space="preserve">, se ha configurado un esquema de </w:t>
+      </w:r>
+      <w:r>
+        <w:rPr>
+          <w:b/>
+          <w:bCs/>
+        </w:rPr>
+        <w:t>Paso Fijo (</w:t>
+      </w:r>
+      <w:proofErr w:type="spellStart"/>
+      <w:r>
+        <w:rPr>
+          <w:b/>
+          <w:bCs/>
+        </w:rPr>
+        <w:t>Fixed</w:t>
+      </w:r>
+      <w:proofErr w:type="spellEnd"/>
+      <w:r>
+        <w:rPr>
+          <w:b/>
+          <w:bCs/>
+        </w:rPr>
+        <w:t>-step)</w:t>
+      </w:r>
+      <w:r>
+        <w:t xml:space="preserve"> con un tiempo de muestreo de </w:t>
+      </w:r>
+      <w:r>
+        <w:rPr>
+          <w:b/>
+          <w:bCs/>
+        </w:rPr>
+        <w:t>0.01 s</w:t>
+      </w:r>
+      <w:r>
+        <w:t>. Esta configuración es crítica, ya que define la frecuencia de ejecución del controlador (100 Hz), permitiendo que el código sea compatible con sistemas de tiempo real.</w:t>
+      </w:r>
+    </w:p>
+    <w:p>
+      <w:pPr>
+        <w:numPr>
+          <w:ilvl w:val="0"/>
+          <w:numId w:val="19"/>
+        </w:numPr>
+      </w:pPr>
+      <w:r>
+        <w:rPr>
+          <w:b/>
+          <w:bCs/>
+        </w:rPr>
+        <w:t>Selección del Target (GRT):</w:t>
+      </w:r>
+      <w:r>
+        <w:t xml:space="preserve"> Se ha seleccionado el sistema de generación </w:t>
+      </w:r>
+      <w:proofErr w:type="spellStart"/>
+      <w:r>
+        <w:rPr>
+          <w:b/>
+          <w:bCs/>
+        </w:rPr>
+        <w:t>Generic</w:t>
+      </w:r>
+      <w:proofErr w:type="spellEnd"/>
+      <w:r>
+        <w:rPr>
+          <w:b/>
+          <w:bCs/>
+        </w:rPr>
+        <w:t xml:space="preserve"> Real-Time (</w:t>
+      </w:r>
+      <w:proofErr w:type="spellStart"/>
+      <w:r>
+        <w:rPr>
+          <w:b/>
+          <w:bCs/>
+        </w:rPr>
+        <w:t>grt.tlc</w:t>
+      </w:r>
+      <w:proofErr w:type="spellEnd"/>
+      <w:r>
+        <w:rPr>
+          <w:b/>
+          <w:bCs/>
+        </w:rPr>
+        <w:t>)</w:t>
+      </w:r>
+      <w:r>
+        <w:t xml:space="preserve">. Este perfil está optimizado para generar código C/C++ que puede compilarse como un ejecutable independiente (.exe), ideal para realizar validaciones de tipo </w:t>
+      </w:r>
+      <w:r>
+        <w:rPr>
+          <w:b/>
+          <w:bCs/>
+        </w:rPr>
+        <w:t>Software-in-</w:t>
+      </w:r>
+      <w:proofErr w:type="spellStart"/>
+      <w:r>
+        <w:rPr>
+          <w:b/>
+          <w:bCs/>
+        </w:rPr>
+        <w:t>the</w:t>
+      </w:r>
+      <w:proofErr w:type="spellEnd"/>
+      <w:r>
+        <w:rPr>
+          <w:b/>
+          <w:bCs/>
+        </w:rPr>
+        <w:t>-Loop (SIL)</w:t>
+      </w:r>
+      <w:r>
+        <w:t xml:space="preserve"> en el PC de desarrollo.</w:t>
+      </w:r>
+    </w:p>
+    <w:p>
+      <w:pPr>
+        <w:numPr>
+          <w:ilvl w:val="0"/>
+          <w:numId w:val="19"/>
+        </w:numPr>
+      </w:pPr>
+      <w:r>
+        <w:rPr>
+          <w:b/>
+          <w:bCs/>
+        </w:rPr>
+        <w:t>Generación mediante "</w:t>
+      </w:r>
+      <w:proofErr w:type="spellStart"/>
+      <w:r>
+        <w:rPr>
+          <w:b/>
+          <w:bCs/>
+        </w:rPr>
+        <w:t>Build</w:t>
+      </w:r>
+      <w:proofErr w:type="spellEnd"/>
+      <w:r>
+        <w:rPr>
+          <w:b/>
+          <w:bCs/>
+        </w:rPr>
+        <w:t xml:space="preserve"> </w:t>
+      </w:r>
+      <w:proofErr w:type="spellStart"/>
+      <w:r>
+        <w:rPr>
+          <w:b/>
+          <w:bCs/>
+        </w:rPr>
+        <w:t>Subsystem</w:t>
+      </w:r>
+      <w:proofErr w:type="spellEnd"/>
+      <w:r>
+        <w:rPr>
+          <w:b/>
+          <w:bCs/>
+        </w:rPr>
+        <w:t>":</w:t>
+      </w:r>
+      <w:r>
+        <w:t xml:space="preserve"> Tras verificar la integridad de las señales, se ha ejecutado el comando de compilación sobre el subsistema del Controlador. Este proceso traduce automáticamente los bloques (PID, filtros y saturaciones) en funciones matemáticas de bajo nivel, invocando al compilador del sistema para generar los archivos fuente (.c y .h) y el binario final.</w:t>
+      </w:r>
+    </w:p>
+    <w:p/>
+    <w:p>
+      <w:pPr>
+        <w:keepNext/>
+        <w:spacing w:after="0" w:afterAutospacing="0"/>
+        <w:jc w:val="center"/>
+      </w:pPr>
+      <w:r>
+        <w:drawing>
+          <wp:inline distT="0" distB="0" distL="0" distR="0" wp14:anchorId="59E6EE1E" wp14:editId="790F231D">
+            <wp:extent cx="6645910" cy="5046345"/>
+            <wp:effectExtent l="19050" t="19050" r="21590" b="20955"/>
+            <wp:docPr id="342465740" name="Imagen 1"/>
+            <wp:cNvGraphicFramePr>
+              <a:graphicFrameLocks xmlns:a="http://schemas.openxmlformats.org/drawingml/2006/main" noChangeAspect="1"/>
+            </wp:cNvGraphicFramePr>
+            <a:graphic xmlns:a="http://schemas.openxmlformats.org/drawingml/2006/main">
+              <a:graphicData uri="http://schemas.openxmlformats.org/drawingml/2006/picture">
+                <pic:pic xmlns:pic="http://schemas.openxmlformats.org/drawingml/2006/picture">
+                  <pic:nvPicPr>
+                    <pic:cNvPr id="342465740" name=""/>
+                    <pic:cNvPicPr/>
+                  </pic:nvPicPr>
+                  <pic:blipFill>
+                    <a:blip r:embed="rId16"/>
+                    <a:stretch>
+                      <a:fillRect/>
+                    </a:stretch>
+                  </pic:blipFill>
+                  <pic:spPr>
+                    <a:xfrm>
+                      <a:off x="0" y="0"/>
+                      <a:ext cx="6645910" cy="5046345"/>
+                    </a:xfrm>
+                    <a:prstGeom prst="rect">
+                      <a:avLst/>
+                    </a:prstGeom>
+                    <a:ln>
+                      <a:solidFill>
+                        <a:schemeClr val="tx1"/>
+                      </a:solidFill>
+                    </a:ln>
+                  </pic:spPr>
+                </pic:pic>
+              </a:graphicData>
+            </a:graphic>
+          </wp:inline>
+        </w:drawing>
+      </w:r>
+    </w:p>
+    <w:p>
+      <w:pPr>
+        <w:pStyle w:val="Descripcin"/>
+        <w:jc w:val="center"/>
+      </w:pPr>
+      <w:r>
+        <w:t xml:space="preserve">Figura </w:t>
+      </w:r>
+      <w:r>
+        <w:fldChar w:fldCharType="begin"/>
+      </w:r>
+      <w:r>
+        <w:instrText xml:space="preserve"> SEQ Figura \* ARABIC </w:instrText>
+      </w:r>
+      <w:r>
+        <w:fldChar w:fldCharType="separate"/>
+      </w:r>
+      <w:r>
+        <w:rPr>
+          <w:noProof/>
+        </w:rPr>
+        <w:t>8</w:t>
+      </w:r>
+      <w:r>
+        <w:fldChar w:fldCharType="end"/>
+      </w:r>
+      <w:r>
+        <w:t>. Procedimiento de generación del código C++</w:t>
       </w:r>
     </w:p>
     <w:p/>
@@ -842,8 +3128,367 @@
     <w:p/>
     <w:p/>
     <w:p/>
+    <w:p>
+      <w:pPr>
+        <w:rPr>
+          <w:b/>
+          <w:bCs/>
+        </w:rPr>
+      </w:pPr>
+      <w:r>
+        <w:rPr>
+          <w:b/>
+          <w:bCs/>
+        </w:rPr>
+        <w:t>2.2. Escenarios de Perturbación y Robustez</w:t>
+      </w:r>
+    </w:p>
+    <w:p>
+      <w:r>
+        <w:t>Para validar el diseño del FADEC, no basta con una simulación en condiciones ideales. Se han implementado dos tipos de perturbaciones que fuerzan al sistema a trabajar en condiciones realistas de operación.</w:t>
+      </w:r>
+    </w:p>
+    <w:p>
+      <w:pPr>
+        <w:rPr>
+          <w:b/>
+          <w:bCs/>
+        </w:rPr>
+      </w:pPr>
+      <w:r>
+        <w:rPr>
+          <w:b/>
+          <w:bCs/>
+        </w:rPr>
+        <w:t>2.2.1. Ruido de Medida en el Sensor de Empuje</w:t>
+      </w:r>
+    </w:p>
+    <w:p>
+      <w:r>
+        <w:t>En un motor a reacción real, la lectura del empuje no es una señal limpia debido a las vibraciones mecánicas de alta frecuencia y a las interferencias electromagnéticas en el cableado de los sensores de presión.</w:t>
+      </w:r>
+    </w:p>
+    <w:p>
+      <w:r>
+        <w:t xml:space="preserve">Para modelar este fenómeno, se ha introducido un bloque de </w:t>
+      </w:r>
+      <w:r>
+        <w:rPr>
+          <w:b/>
+          <w:bCs/>
+        </w:rPr>
+        <w:t>Ruido Blanco de Banda Limitada (Band-</w:t>
+      </w:r>
+      <w:proofErr w:type="spellStart"/>
+      <w:r>
+        <w:rPr>
+          <w:b/>
+          <w:bCs/>
+        </w:rPr>
+        <w:t>Limited</w:t>
+      </w:r>
+      <w:proofErr w:type="spellEnd"/>
+      <w:r>
+        <w:rPr>
+          <w:b/>
+          <w:bCs/>
+        </w:rPr>
+        <w:t xml:space="preserve"> White </w:t>
+      </w:r>
+      <w:proofErr w:type="spellStart"/>
+      <w:r>
+        <w:rPr>
+          <w:b/>
+          <w:bCs/>
+        </w:rPr>
+        <w:t>Noise</w:t>
+      </w:r>
+      <w:proofErr w:type="spellEnd"/>
+      <w:r>
+        <w:rPr>
+          <w:b/>
+          <w:bCs/>
+        </w:rPr>
+        <w:t>)</w:t>
+      </w:r>
+      <w:r>
+        <w:t xml:space="preserve"> sumado a la señal de realimentación justo después del muestreo. Se ha configurado una potencia de ruido de 100 con un tiempo de muestreo sincronizado a 0.01 s.</w:t>
+      </w:r>
+    </w:p>
+    <w:p>
+      <w:pPr>
+        <w:keepNext/>
+        <w:spacing w:after="0" w:afterAutospacing="0"/>
+        <w:jc w:val="center"/>
+      </w:pPr>
+      <w:r>
+        <w:drawing>
+          <wp:inline distT="0" distB="0" distL="0" distR="0" wp14:anchorId="05816419" wp14:editId="7AF6FF65">
+            <wp:extent cx="6645910" cy="2885440"/>
+            <wp:effectExtent l="0" t="0" r="2540" b="0"/>
+            <wp:docPr id="728661016" name="Imagen 1"/>
+            <wp:cNvGraphicFramePr>
+              <a:graphicFrameLocks xmlns:a="http://schemas.openxmlformats.org/drawingml/2006/main" noChangeAspect="1"/>
+            </wp:cNvGraphicFramePr>
+            <a:graphic xmlns:a="http://schemas.openxmlformats.org/drawingml/2006/main">
+              <a:graphicData uri="http://schemas.openxmlformats.org/drawingml/2006/picture">
+                <pic:pic xmlns:pic="http://schemas.openxmlformats.org/drawingml/2006/picture">
+                  <pic:nvPicPr>
+                    <pic:cNvPr id="728661016" name=""/>
+                    <pic:cNvPicPr/>
+                  </pic:nvPicPr>
+                  <pic:blipFill>
+                    <a:blip r:embed="rId17"/>
+                    <a:stretch>
+                      <a:fillRect/>
+                    </a:stretch>
+                  </pic:blipFill>
+                  <pic:spPr>
+                    <a:xfrm>
+                      <a:off x="0" y="0"/>
+                      <a:ext cx="6645910" cy="2885440"/>
+                    </a:xfrm>
+                    <a:prstGeom prst="rect">
+                      <a:avLst/>
+                    </a:prstGeom>
+                  </pic:spPr>
+                </pic:pic>
+              </a:graphicData>
+            </a:graphic>
+          </wp:inline>
+        </w:drawing>
+      </w:r>
+    </w:p>
+    <w:p>
+      <w:pPr>
+        <w:pStyle w:val="Descripcin"/>
+        <w:jc w:val="center"/>
+      </w:pPr>
+      <w:r>
+        <w:t xml:space="preserve">Figura </w:t>
+      </w:r>
+      <w:r>
+        <w:fldChar w:fldCharType="begin"/>
+      </w:r>
+      <w:r>
+        <w:instrText xml:space="preserve"> SEQ Figura \* ARABIC </w:instrText>
+      </w:r>
+      <w:r>
+        <w:fldChar w:fldCharType="separate"/>
+      </w:r>
+      <w:r>
+        <w:rPr>
+          <w:noProof/>
+        </w:rPr>
+        <w:t>9</w:t>
+      </w:r>
+      <w:r>
+        <w:fldChar w:fldCharType="end"/>
+      </w:r>
+      <w:r>
+        <w:t>. Respuesta de la señal ante ruido en la señal de medición</w:t>
+      </w:r>
+    </w:p>
+    <w:p>
+      <w:r>
+        <w:t>Como se observa en la gráfica, a pesar de que la señal de realimentación presenta fluctuaciones constantes, el controlador PI logra mantener el empuje estable alrededor de la consigna. La ausencia de acción derivativa en el PID evita que este ruido se amplifique y provoque movimientos erráticos en la válvula de combustible</w:t>
+      </w:r>
+      <w:r>
+        <w:t>.</w:t>
+      </w:r>
+    </w:p>
+    <w:p>
+      <w:pPr>
+        <w:pStyle w:val="Ttulo2"/>
+      </w:pPr>
+      <w:bookmarkStart w:id="10" w:name="_Toc224668017"/>
+      <w:r>
+        <w:t>2.2.2. Simulación de Descenso Dinámico (Variación de Densidad)</w:t>
+      </w:r>
+      <w:bookmarkEnd w:id="10"/>
+    </w:p>
+    <w:p>
+      <w:r>
+        <w:t xml:space="preserve">Para evaluar la robustez del FADEC en un escenario real, se ha sustituido el valor fijo de altitud por una </w:t>
+      </w:r>
+      <w:r>
+        <w:rPr>
+          <w:b/>
+          <w:bCs/>
+        </w:rPr>
+        <w:t>rampa de descenso lineal</w:t>
+      </w:r>
+      <w:r>
+        <w:t xml:space="preserve"> que reduce la cota de 10.000 m </w:t>
+      </w:r>
+      <w:r>
+        <w:t>en 3 m/s</w:t>
+      </w:r>
+      <w:r>
+        <w:t>. Este ensayo simula una aproximación a pista o un descenso de emergencia, donde las condiciones atmosféricas cambian de forma continua.</w:t>
+      </w:r>
+    </w:p>
+    <w:p>
+      <w:pPr>
+        <w:pStyle w:val="Prrafodelista"/>
+        <w:numPr>
+          <w:ilvl w:val="0"/>
+          <w:numId w:val="10"/>
+        </w:numPr>
+      </w:pPr>
+      <w:r>
+        <w:rPr>
+          <w:b/>
+          <w:bCs/>
+        </w:rPr>
+        <w:t>Análisis del fenómeno físico:</w:t>
+      </w:r>
+      <w:r>
+        <w:t xml:space="preserve"> A medida que el avión pierde altitud, la densidad del aire aumenta significativamente. Al entrar aire más denso en el motor, la turbina genera un mayor empuje de forma natural para un mismo nivel de combustible. Si el controlador no actuara, el empuje se dispararía por encima de la consigna de 8.000 N.</w:t>
+      </w:r>
+    </w:p>
+    <w:p>
+      <w:pPr>
+        <w:pStyle w:val="Prrafodelista"/>
+        <w:numPr>
+          <w:ilvl w:val="0"/>
+          <w:numId w:val="10"/>
+        </w:numPr>
+      </w:pPr>
+      <w:r>
+        <w:rPr>
+          <w:b/>
+          <w:bCs/>
+        </w:rPr>
+        <w:t>Respuesta del Controlador:</w:t>
+      </w:r>
+      <w:r>
+        <w:t xml:space="preserve"> Como se observa en la telemetría, el PID detecta este incremento de empuje provocado por el cambio de densidad y reacciona de forma dinámica reduciendo gradualmente la apertura de la válvula de combustible (Throttle). </w:t>
+      </w:r>
+    </w:p>
+    <w:p>
+      <w:r>
+        <w:t>En la siguiente figura se muestra la respuesta. En ella se ha decidido obviar el ruido para que la respuesta del controlador se viera mejor:</w:t>
+      </w:r>
+    </w:p>
+    <w:p>
+      <w:pPr>
+        <w:keepNext/>
+        <w:spacing w:after="0" w:afterAutospacing="0"/>
+        <w:jc w:val="center"/>
+      </w:pPr>
+      <w:r>
+        <w:drawing>
+          <wp:inline distT="0" distB="0" distL="0" distR="0" wp14:anchorId="75E49D60" wp14:editId="57895867">
+            <wp:extent cx="6645910" cy="3305175"/>
+            <wp:effectExtent l="0" t="0" r="2540" b="9525"/>
+            <wp:docPr id="1746379921" name="Imagen 1"/>
+            <wp:cNvGraphicFramePr>
+              <a:graphicFrameLocks xmlns:a="http://schemas.openxmlformats.org/drawingml/2006/main" noChangeAspect="1"/>
+            </wp:cNvGraphicFramePr>
+            <a:graphic xmlns:a="http://schemas.openxmlformats.org/drawingml/2006/main">
+              <a:graphicData uri="http://schemas.openxmlformats.org/drawingml/2006/picture">
+                <pic:pic xmlns:pic="http://schemas.openxmlformats.org/drawingml/2006/picture">
+                  <pic:nvPicPr>
+                    <pic:cNvPr id="1746379921" name=""/>
+                    <pic:cNvPicPr/>
+                  </pic:nvPicPr>
+                  <pic:blipFill>
+                    <a:blip r:embed="rId18"/>
+                    <a:stretch>
+                      <a:fillRect/>
+                    </a:stretch>
+                  </pic:blipFill>
+                  <pic:spPr>
+                    <a:xfrm>
+                      <a:off x="0" y="0"/>
+                      <a:ext cx="6645910" cy="3305175"/>
+                    </a:xfrm>
+                    <a:prstGeom prst="rect">
+                      <a:avLst/>
+                    </a:prstGeom>
+                  </pic:spPr>
+                </pic:pic>
+              </a:graphicData>
+            </a:graphic>
+          </wp:inline>
+        </w:drawing>
+      </w:r>
+    </w:p>
+    <w:p>
+      <w:pPr>
+        <w:pStyle w:val="Descripcin"/>
+        <w:jc w:val="center"/>
+      </w:pPr>
+      <w:r>
+        <w:t xml:space="preserve">Figura </w:t>
+      </w:r>
+      <w:r>
+        <w:fldChar w:fldCharType="begin"/>
+      </w:r>
+      <w:r>
+        <w:instrText xml:space="preserve"> SEQ Figura \* ARABIC </w:instrText>
+      </w:r>
+      <w:r>
+        <w:fldChar w:fldCharType="separate"/>
+      </w:r>
+      <w:r>
+        <w:rPr>
+          <w:noProof/>
+        </w:rPr>
+        <w:t>10</w:t>
+      </w:r>
+      <w:r>
+        <w:fldChar w:fldCharType="end"/>
+      </w:r>
+      <w:r>
+        <w:t>. Respuesta al descenso</w:t>
+      </w:r>
+    </w:p>
+    <w:p/>
+    <w:p>
+      <w:r>
+        <w:drawing>
+          <wp:inline distT="0" distB="0" distL="0" distR="0" wp14:anchorId="16596837" wp14:editId="500A13F3">
+            <wp:extent cx="6645910" cy="3305175"/>
+            <wp:effectExtent l="0" t="0" r="2540" b="9525"/>
+            <wp:docPr id="1440834107" name="Imagen 1"/>
+            <wp:cNvGraphicFramePr>
+              <a:graphicFrameLocks xmlns:a="http://schemas.openxmlformats.org/drawingml/2006/main" noChangeAspect="1"/>
+            </wp:cNvGraphicFramePr>
+            <a:graphic xmlns:a="http://schemas.openxmlformats.org/drawingml/2006/main">
+              <a:graphicData uri="http://schemas.openxmlformats.org/drawingml/2006/picture">
+                <pic:pic xmlns:pic="http://schemas.openxmlformats.org/drawingml/2006/picture">
+                  <pic:nvPicPr>
+                    <pic:cNvPr id="1440834107" name=""/>
+                    <pic:cNvPicPr/>
+                  </pic:nvPicPr>
+                  <pic:blipFill>
+                    <a:blip r:embed="rId19"/>
+                    <a:stretch>
+                      <a:fillRect/>
+                    </a:stretch>
+                  </pic:blipFill>
+                  <pic:spPr>
+                    <a:xfrm>
+                      <a:off x="0" y="0"/>
+                      <a:ext cx="6645910" cy="3305175"/>
+                    </a:xfrm>
+                    <a:prstGeom prst="rect">
+                      <a:avLst/>
+                    </a:prstGeom>
+                  </pic:spPr>
+                </pic:pic>
+              </a:graphicData>
+            </a:graphic>
+          </wp:inline>
+        </w:drawing>
+      </w:r>
+    </w:p>
+    <w:p/>
+    <w:p/>
     <w:sectPr>
-      <w:headerReference w:type="default" r:id="rId11"/>
+      <w:headerReference w:type="default" r:id="rId20"/>
       <w:pgSz w:w="11906" w:h="16838"/>
       <w:pgMar w:top="1264" w:right="720" w:bottom="720" w:left="720" w:header="142" w:footer="709" w:gutter="0"/>
       <w:cols w:space="708"/>
@@ -977,6 +3622,417 @@
 <file path=word/numbering.xml><?xml version="1.0" encoding="utf-8"?>
 <w:numbering xmlns:wpc="http://schemas.microsoft.com/office/word/2010/wordprocessingCanvas" xmlns:cx="http://schemas.microsoft.com/office/drawing/2014/chartex" xmlns:cx1="http://schemas.microsoft.com/office/drawing/2015/9/8/chartex" xmlns:cx2="http://schemas.microsoft.com/office/drawing/2015/10/21/chartex" xmlns:cx3="http://schemas.microsoft.com/office/drawing/2016/5/9/chartex" xmlns:cx4="http://schemas.microsoft.com/office/drawing/2016/5/10/chartex" xmlns:cx5="http://schemas.microsoft.com/office/drawing/2016/5/11/chartex" xmlns:cx6="http://schemas.microsoft.com/office/drawing/2016/5/12/chartex" xmlns:cx7="http://schemas.microsoft.com/office/drawing/2016/5/13/chartex" xmlns:cx8="http://schemas.microsoft.com/office/drawing/2016/5/14/chartex" xmlns:mc="http://schemas.openxmlformats.org/markup-compatibility/2006" xmlns:aink="http://schemas.microsoft.com/office/drawing/2016/ink" xmlns:am3d="http://schemas.microsoft.com/office/drawing/2017/model3d" xmlns:o="urn:schemas-microsoft-com:office:office" xmlns:oel="http://schemas.microsoft.com/office/2019/extlst" xmlns:r="http://schemas.openxmlformats.org/officeDocument/2006/relationships" xmlns:m="http://schemas.openxmlformats.org/officeDocument/2006/math" xmlns:v="urn:schemas-microsoft-com:vml" xmlns:wp14="http://schemas.microsoft.com/office/word/2010/wordprocessingDrawing" xmlns:wp="http://schemas.openxmlformats.org/drawingml/2006/wordprocessingDrawing" xmlns:w10="urn:schemas-microsoft-com:office:word" xmlns:w="http://schemas.openxmlformats.org/wordprocessingml/2006/main" xmlns:w14="http://schemas.microsoft.com/office/word/2010/wordml" xmlns:w15="http://schemas.microsoft.com/office/word/2012/wordml" xmlns:w16cex="http://schemas.microsoft.com/office/word/2018/wordml/cex" xmlns:w16cid="http://schemas.microsoft.com/office/word/2016/wordml/cid" xmlns:w16="http://schemas.microsoft.com/office/word/2018/wordml" xmlns:w16du="http://schemas.microsoft.com/office/word/2023/wordml/word16du" xmlns:w16sdtdh="http://schemas.microsoft.com/office/word/2020/wordml/sdtdatahash" xmlns:w16sdtfl="http://schemas.microsoft.com/office/word/2024/wordml/sdtformatlock" xmlns:w16se="http://schemas.microsoft.com/office/word/2015/wordml/symex" xmlns:wpg="http://schemas.microsoft.com/office/word/2010/wordprocessingGroup" xmlns:wpi="http://schemas.microsoft.com/office/word/2010/wordprocessingInk" xmlns:wne="http://schemas.microsoft.com/office/word/2006/wordml" xmlns:wps="http://schemas.microsoft.com/office/word/2010/wordprocessingShape" mc:Ignorable="w14 w15 w16se w16cid w16 w16cex w16sdtdh w16sdtfl w16du wp14">
   <w:abstractNum w:abstractNumId="0" w15:restartNumberingAfterBreak="0">
+    <w:nsid w:val="080F69E0"/>
+    <w:multiLevelType w:val="multilevel"/>
+    <w:tmpl w:val="FF2A97B0"/>
+    <w:lvl w:ilvl="0">
+      <w:start w:val="1"/>
+      <w:numFmt w:val="bullet"/>
+      <w:lvlText w:val=""/>
+      <w:lvlJc w:val="left"/>
+      <w:pPr>
+        <w:tabs>
+          <w:tab w:val="num" w:pos="720"/>
+        </w:tabs>
+        <w:ind w:left="720" w:hanging="360"/>
+      </w:pPr>
+      <w:rPr>
+        <w:rFonts w:ascii="Symbol" w:hAnsi="Symbol" w:hint="default"/>
+        <w:sz w:val="20"/>
+      </w:rPr>
+    </w:lvl>
+    <w:lvl w:ilvl="1" w:tentative="1">
+      <w:start w:val="1"/>
+      <w:numFmt w:val="bullet"/>
+      <w:lvlText w:val="o"/>
+      <w:lvlJc w:val="left"/>
+      <w:pPr>
+        <w:tabs>
+          <w:tab w:val="num" w:pos="1440"/>
+        </w:tabs>
+        <w:ind w:left="1440" w:hanging="360"/>
+      </w:pPr>
+      <w:rPr>
+        <w:rFonts w:ascii="Courier New" w:hAnsi="Courier New" w:hint="default"/>
+        <w:sz w:val="20"/>
+      </w:rPr>
+    </w:lvl>
+    <w:lvl w:ilvl="2" w:tentative="1">
+      <w:start w:val="1"/>
+      <w:numFmt w:val="bullet"/>
+      <w:lvlText w:val=""/>
+      <w:lvlJc w:val="left"/>
+      <w:pPr>
+        <w:tabs>
+          <w:tab w:val="num" w:pos="2160"/>
+        </w:tabs>
+        <w:ind w:left="2160" w:hanging="360"/>
+      </w:pPr>
+      <w:rPr>
+        <w:rFonts w:ascii="Wingdings" w:hAnsi="Wingdings" w:hint="default"/>
+        <w:sz w:val="20"/>
+      </w:rPr>
+    </w:lvl>
+    <w:lvl w:ilvl="3" w:tentative="1">
+      <w:start w:val="1"/>
+      <w:numFmt w:val="bullet"/>
+      <w:lvlText w:val=""/>
+      <w:lvlJc w:val="left"/>
+      <w:pPr>
+        <w:tabs>
+          <w:tab w:val="num" w:pos="2880"/>
+        </w:tabs>
+        <w:ind w:left="2880" w:hanging="360"/>
+      </w:pPr>
+      <w:rPr>
+        <w:rFonts w:ascii="Wingdings" w:hAnsi="Wingdings" w:hint="default"/>
+        <w:sz w:val="20"/>
+      </w:rPr>
+    </w:lvl>
+    <w:lvl w:ilvl="4" w:tentative="1">
+      <w:start w:val="1"/>
+      <w:numFmt w:val="bullet"/>
+      <w:lvlText w:val=""/>
+      <w:lvlJc w:val="left"/>
+      <w:pPr>
+        <w:tabs>
+          <w:tab w:val="num" w:pos="3600"/>
+        </w:tabs>
+        <w:ind w:left="3600" w:hanging="360"/>
+      </w:pPr>
+      <w:rPr>
+        <w:rFonts w:ascii="Wingdings" w:hAnsi="Wingdings" w:hint="default"/>
+        <w:sz w:val="20"/>
+      </w:rPr>
+    </w:lvl>
+    <w:lvl w:ilvl="5" w:tentative="1">
+      <w:start w:val="1"/>
+      <w:numFmt w:val="bullet"/>
+      <w:lvlText w:val=""/>
+      <w:lvlJc w:val="left"/>
+      <w:pPr>
+        <w:tabs>
+          <w:tab w:val="num" w:pos="4320"/>
+        </w:tabs>
+        <w:ind w:left="4320" w:hanging="360"/>
+      </w:pPr>
+      <w:rPr>
+        <w:rFonts w:ascii="Wingdings" w:hAnsi="Wingdings" w:hint="default"/>
+        <w:sz w:val="20"/>
+      </w:rPr>
+    </w:lvl>
+    <w:lvl w:ilvl="6" w:tentative="1">
+      <w:start w:val="1"/>
+      <w:numFmt w:val="bullet"/>
+      <w:lvlText w:val=""/>
+      <w:lvlJc w:val="left"/>
+      <w:pPr>
+        <w:tabs>
+          <w:tab w:val="num" w:pos="5040"/>
+        </w:tabs>
+        <w:ind w:left="5040" w:hanging="360"/>
+      </w:pPr>
+      <w:rPr>
+        <w:rFonts w:ascii="Wingdings" w:hAnsi="Wingdings" w:hint="default"/>
+        <w:sz w:val="20"/>
+      </w:rPr>
+    </w:lvl>
+    <w:lvl w:ilvl="7" w:tentative="1">
+      <w:start w:val="1"/>
+      <w:numFmt w:val="bullet"/>
+      <w:lvlText w:val=""/>
+      <w:lvlJc w:val="left"/>
+      <w:pPr>
+        <w:tabs>
+          <w:tab w:val="num" w:pos="5760"/>
+        </w:tabs>
+        <w:ind w:left="5760" w:hanging="360"/>
+      </w:pPr>
+      <w:rPr>
+        <w:rFonts w:ascii="Wingdings" w:hAnsi="Wingdings" w:hint="default"/>
+        <w:sz w:val="20"/>
+      </w:rPr>
+    </w:lvl>
+    <w:lvl w:ilvl="8" w:tentative="1">
+      <w:start w:val="1"/>
+      <w:numFmt w:val="bullet"/>
+      <w:lvlText w:val=""/>
+      <w:lvlJc w:val="left"/>
+      <w:pPr>
+        <w:tabs>
+          <w:tab w:val="num" w:pos="6480"/>
+        </w:tabs>
+        <w:ind w:left="6480" w:hanging="360"/>
+      </w:pPr>
+      <w:rPr>
+        <w:rFonts w:ascii="Wingdings" w:hAnsi="Wingdings" w:hint="default"/>
+        <w:sz w:val="20"/>
+      </w:rPr>
+    </w:lvl>
+  </w:abstractNum>
+  <w:abstractNum w:abstractNumId="1" w15:restartNumberingAfterBreak="0">
+    <w:nsid w:val="0E226902"/>
+    <w:multiLevelType w:val="multilevel"/>
+    <w:tmpl w:val="6576BC7C"/>
+    <w:lvl w:ilvl="0">
+      <w:start w:val="1"/>
+      <w:numFmt w:val="bullet"/>
+      <w:lvlText w:val=""/>
+      <w:lvlJc w:val="left"/>
+      <w:pPr>
+        <w:tabs>
+          <w:tab w:val="num" w:pos="720"/>
+        </w:tabs>
+        <w:ind w:left="720" w:hanging="360"/>
+      </w:pPr>
+      <w:rPr>
+        <w:rFonts w:ascii="Symbol" w:hAnsi="Symbol" w:hint="default"/>
+        <w:sz w:val="20"/>
+      </w:rPr>
+    </w:lvl>
+    <w:lvl w:ilvl="1" w:tentative="1">
+      <w:start w:val="1"/>
+      <w:numFmt w:val="bullet"/>
+      <w:lvlText w:val="o"/>
+      <w:lvlJc w:val="left"/>
+      <w:pPr>
+        <w:tabs>
+          <w:tab w:val="num" w:pos="1440"/>
+        </w:tabs>
+        <w:ind w:left="1440" w:hanging="360"/>
+      </w:pPr>
+      <w:rPr>
+        <w:rFonts w:ascii="Courier New" w:hAnsi="Courier New" w:hint="default"/>
+        <w:sz w:val="20"/>
+      </w:rPr>
+    </w:lvl>
+    <w:lvl w:ilvl="2" w:tentative="1">
+      <w:start w:val="1"/>
+      <w:numFmt w:val="bullet"/>
+      <w:lvlText w:val=""/>
+      <w:lvlJc w:val="left"/>
+      <w:pPr>
+        <w:tabs>
+          <w:tab w:val="num" w:pos="2160"/>
+        </w:tabs>
+        <w:ind w:left="2160" w:hanging="360"/>
+      </w:pPr>
+      <w:rPr>
+        <w:rFonts w:ascii="Wingdings" w:hAnsi="Wingdings" w:hint="default"/>
+        <w:sz w:val="20"/>
+      </w:rPr>
+    </w:lvl>
+    <w:lvl w:ilvl="3" w:tentative="1">
+      <w:start w:val="1"/>
+      <w:numFmt w:val="bullet"/>
+      <w:lvlText w:val=""/>
+      <w:lvlJc w:val="left"/>
+      <w:pPr>
+        <w:tabs>
+          <w:tab w:val="num" w:pos="2880"/>
+        </w:tabs>
+        <w:ind w:left="2880" w:hanging="360"/>
+      </w:pPr>
+      <w:rPr>
+        <w:rFonts w:ascii="Wingdings" w:hAnsi="Wingdings" w:hint="default"/>
+        <w:sz w:val="20"/>
+      </w:rPr>
+    </w:lvl>
+    <w:lvl w:ilvl="4" w:tentative="1">
+      <w:start w:val="1"/>
+      <w:numFmt w:val="bullet"/>
+      <w:lvlText w:val=""/>
+      <w:lvlJc w:val="left"/>
+      <w:pPr>
+        <w:tabs>
+          <w:tab w:val="num" w:pos="3600"/>
+        </w:tabs>
+        <w:ind w:left="3600" w:hanging="360"/>
+      </w:pPr>
+      <w:rPr>
+        <w:rFonts w:ascii="Wingdings" w:hAnsi="Wingdings" w:hint="default"/>
+        <w:sz w:val="20"/>
+      </w:rPr>
+    </w:lvl>
+    <w:lvl w:ilvl="5" w:tentative="1">
+      <w:start w:val="1"/>
+      <w:numFmt w:val="bullet"/>
+      <w:lvlText w:val=""/>
+      <w:lvlJc w:val="left"/>
+      <w:pPr>
+        <w:tabs>
+          <w:tab w:val="num" w:pos="4320"/>
+        </w:tabs>
+        <w:ind w:left="4320" w:hanging="360"/>
+      </w:pPr>
+      <w:rPr>
+        <w:rFonts w:ascii="Wingdings" w:hAnsi="Wingdings" w:hint="default"/>
+        <w:sz w:val="20"/>
+      </w:rPr>
+    </w:lvl>
+    <w:lvl w:ilvl="6" w:tentative="1">
+      <w:start w:val="1"/>
+      <w:numFmt w:val="bullet"/>
+      <w:lvlText w:val=""/>
+      <w:lvlJc w:val="left"/>
+      <w:pPr>
+        <w:tabs>
+          <w:tab w:val="num" w:pos="5040"/>
+        </w:tabs>
+        <w:ind w:left="5040" w:hanging="360"/>
+      </w:pPr>
+      <w:rPr>
+        <w:rFonts w:ascii="Wingdings" w:hAnsi="Wingdings" w:hint="default"/>
+        <w:sz w:val="20"/>
+      </w:rPr>
+    </w:lvl>
+    <w:lvl w:ilvl="7" w:tentative="1">
+      <w:start w:val="1"/>
+      <w:numFmt w:val="bullet"/>
+      <w:lvlText w:val=""/>
+      <w:lvlJc w:val="left"/>
+      <w:pPr>
+        <w:tabs>
+          <w:tab w:val="num" w:pos="5760"/>
+        </w:tabs>
+        <w:ind w:left="5760" w:hanging="360"/>
+      </w:pPr>
+      <w:rPr>
+        <w:rFonts w:ascii="Wingdings" w:hAnsi="Wingdings" w:hint="default"/>
+        <w:sz w:val="20"/>
+      </w:rPr>
+    </w:lvl>
+    <w:lvl w:ilvl="8" w:tentative="1">
+      <w:start w:val="1"/>
+      <w:numFmt w:val="bullet"/>
+      <w:lvlText w:val=""/>
+      <w:lvlJc w:val="left"/>
+      <w:pPr>
+        <w:tabs>
+          <w:tab w:val="num" w:pos="6480"/>
+        </w:tabs>
+        <w:ind w:left="6480" w:hanging="360"/>
+      </w:pPr>
+      <w:rPr>
+        <w:rFonts w:ascii="Wingdings" w:hAnsi="Wingdings" w:hint="default"/>
+        <w:sz w:val="20"/>
+      </w:rPr>
+    </w:lvl>
+  </w:abstractNum>
+  <w:abstractNum w:abstractNumId="2" w15:restartNumberingAfterBreak="0">
+    <w:nsid w:val="120D3736"/>
+    <w:multiLevelType w:val="multilevel"/>
+    <w:tmpl w:val="8BA2593E"/>
+    <w:lvl w:ilvl="0">
+      <w:start w:val="1"/>
+      <w:numFmt w:val="decimal"/>
+      <w:lvlText w:val="%1."/>
+      <w:lvlJc w:val="left"/>
+      <w:pPr>
+        <w:tabs>
+          <w:tab w:val="num" w:pos="720"/>
+        </w:tabs>
+        <w:ind w:left="720" w:hanging="360"/>
+      </w:pPr>
+    </w:lvl>
+    <w:lvl w:ilvl="1" w:tentative="1">
+      <w:start w:val="1"/>
+      <w:numFmt w:val="decimal"/>
+      <w:lvlText w:val="%2."/>
+      <w:lvlJc w:val="left"/>
+      <w:pPr>
+        <w:tabs>
+          <w:tab w:val="num" w:pos="1440"/>
+        </w:tabs>
+        <w:ind w:left="1440" w:hanging="360"/>
+      </w:pPr>
+    </w:lvl>
+    <w:lvl w:ilvl="2" w:tentative="1">
+      <w:start w:val="1"/>
+      <w:numFmt w:val="decimal"/>
+      <w:lvlText w:val="%3."/>
+      <w:lvlJc w:val="left"/>
+      <w:pPr>
+        <w:tabs>
+          <w:tab w:val="num" w:pos="2160"/>
+        </w:tabs>
+        <w:ind w:left="2160" w:hanging="360"/>
+      </w:pPr>
+    </w:lvl>
+    <w:lvl w:ilvl="3" w:tentative="1">
+      <w:start w:val="1"/>
+      <w:numFmt w:val="decimal"/>
+      <w:lvlText w:val="%4."/>
+      <w:lvlJc w:val="left"/>
+      <w:pPr>
+        <w:tabs>
+          <w:tab w:val="num" w:pos="2880"/>
+        </w:tabs>
+        <w:ind w:left="2880" w:hanging="360"/>
+      </w:pPr>
+    </w:lvl>
+    <w:lvl w:ilvl="4" w:tentative="1">
+      <w:start w:val="1"/>
+      <w:numFmt w:val="decimal"/>
+      <w:lvlText w:val="%5."/>
+      <w:lvlJc w:val="left"/>
+      <w:pPr>
+        <w:tabs>
+          <w:tab w:val="num" w:pos="3600"/>
+        </w:tabs>
+        <w:ind w:left="3600" w:hanging="360"/>
+      </w:pPr>
+    </w:lvl>
+    <w:lvl w:ilvl="5" w:tentative="1">
+      <w:start w:val="1"/>
+      <w:numFmt w:val="decimal"/>
+      <w:lvlText w:val="%6."/>
+      <w:lvlJc w:val="left"/>
+      <w:pPr>
+        <w:tabs>
+          <w:tab w:val="num" w:pos="4320"/>
+        </w:tabs>
+        <w:ind w:left="4320" w:hanging="360"/>
+      </w:pPr>
+    </w:lvl>
+    <w:lvl w:ilvl="6" w:tentative="1">
+      <w:start w:val="1"/>
+      <w:numFmt w:val="decimal"/>
+      <w:lvlText w:val="%7."/>
+      <w:lvlJc w:val="left"/>
+      <w:pPr>
+        <w:tabs>
+          <w:tab w:val="num" w:pos="5040"/>
+        </w:tabs>
+        <w:ind w:left="5040" w:hanging="360"/>
+      </w:pPr>
+    </w:lvl>
+    <w:lvl w:ilvl="7" w:tentative="1">
+      <w:start w:val="1"/>
+      <w:numFmt w:val="decimal"/>
+      <w:lvlText w:val="%8."/>
+      <w:lvlJc w:val="left"/>
+      <w:pPr>
+        <w:tabs>
+          <w:tab w:val="num" w:pos="5760"/>
+        </w:tabs>
+        <w:ind w:left="5760" w:hanging="360"/>
+      </w:pPr>
+    </w:lvl>
+    <w:lvl w:ilvl="8" w:tentative="1">
+      <w:start w:val="1"/>
+      <w:numFmt w:val="decimal"/>
+      <w:lvlText w:val="%9."/>
+      <w:lvlJc w:val="left"/>
+      <w:pPr>
+        <w:tabs>
+          <w:tab w:val="num" w:pos="6480"/>
+        </w:tabs>
+        <w:ind w:left="6480" w:hanging="360"/>
+      </w:pPr>
+    </w:lvl>
+  </w:abstractNum>
+  <w:abstractNum w:abstractNumId="3" w15:restartNumberingAfterBreak="0">
     <w:nsid w:val="1ED512A5"/>
     <w:multiLevelType w:val="hybridMultilevel"/>
     <w:tmpl w:val="BFC8FA8C"/>
@@ -1065,7 +4121,156 @@
       </w:pPr>
     </w:lvl>
   </w:abstractNum>
-  <w:abstractNum w:abstractNumId="1" w15:restartNumberingAfterBreak="0">
+  <w:abstractNum w:abstractNumId="4" w15:restartNumberingAfterBreak="0">
+    <w:nsid w:val="26A418CF"/>
+    <w:multiLevelType w:val="multilevel"/>
+    <w:tmpl w:val="CE82F90E"/>
+    <w:lvl w:ilvl="0">
+      <w:start w:val="1"/>
+      <w:numFmt w:val="bullet"/>
+      <w:lvlText w:val=""/>
+      <w:lvlJc w:val="left"/>
+      <w:pPr>
+        <w:tabs>
+          <w:tab w:val="num" w:pos="720"/>
+        </w:tabs>
+        <w:ind w:left="720" w:hanging="360"/>
+      </w:pPr>
+      <w:rPr>
+        <w:rFonts w:ascii="Symbol" w:hAnsi="Symbol" w:hint="default"/>
+        <w:sz w:val="20"/>
+      </w:rPr>
+    </w:lvl>
+    <w:lvl w:ilvl="1" w:tentative="1">
+      <w:start w:val="1"/>
+      <w:numFmt w:val="bullet"/>
+      <w:lvlText w:val="o"/>
+      <w:lvlJc w:val="left"/>
+      <w:pPr>
+        <w:tabs>
+          <w:tab w:val="num" w:pos="1440"/>
+        </w:tabs>
+        <w:ind w:left="1440" w:hanging="360"/>
+      </w:pPr>
+      <w:rPr>
+        <w:rFonts w:ascii="Courier New" w:hAnsi="Courier New" w:hint="default"/>
+        <w:sz w:val="20"/>
+      </w:rPr>
+    </w:lvl>
+    <w:lvl w:ilvl="2" w:tentative="1">
+      <w:start w:val="1"/>
+      <w:numFmt w:val="bullet"/>
+      <w:lvlText w:val=""/>
+      <w:lvlJc w:val="left"/>
+      <w:pPr>
+        <w:tabs>
+          <w:tab w:val="num" w:pos="2160"/>
+        </w:tabs>
+        <w:ind w:left="2160" w:hanging="360"/>
+      </w:pPr>
+      <w:rPr>
+        <w:rFonts w:ascii="Wingdings" w:hAnsi="Wingdings" w:hint="default"/>
+        <w:sz w:val="20"/>
+      </w:rPr>
+    </w:lvl>
+    <w:lvl w:ilvl="3" w:tentative="1">
+      <w:start w:val="1"/>
+      <w:numFmt w:val="bullet"/>
+      <w:lvlText w:val=""/>
+      <w:lvlJc w:val="left"/>
+      <w:pPr>
+        <w:tabs>
+          <w:tab w:val="num" w:pos="2880"/>
+        </w:tabs>
+        <w:ind w:left="2880" w:hanging="360"/>
+      </w:pPr>
+      <w:rPr>
+        <w:rFonts w:ascii="Wingdings" w:hAnsi="Wingdings" w:hint="default"/>
+        <w:sz w:val="20"/>
+      </w:rPr>
+    </w:lvl>
+    <w:lvl w:ilvl="4" w:tentative="1">
+      <w:start w:val="1"/>
+      <w:numFmt w:val="bullet"/>
+      <w:lvlText w:val=""/>
+      <w:lvlJc w:val="left"/>
+      <w:pPr>
+        <w:tabs>
+          <w:tab w:val="num" w:pos="3600"/>
+        </w:tabs>
+        <w:ind w:left="3600" w:hanging="360"/>
+      </w:pPr>
+      <w:rPr>
+        <w:rFonts w:ascii="Wingdings" w:hAnsi="Wingdings" w:hint="default"/>
+        <w:sz w:val="20"/>
+      </w:rPr>
+    </w:lvl>
+    <w:lvl w:ilvl="5" w:tentative="1">
+      <w:start w:val="1"/>
+      <w:numFmt w:val="bullet"/>
+      <w:lvlText w:val=""/>
+      <w:lvlJc w:val="left"/>
+      <w:pPr>
+        <w:tabs>
+          <w:tab w:val="num" w:pos="4320"/>
+        </w:tabs>
+        <w:ind w:left="4320" w:hanging="360"/>
+      </w:pPr>
+      <w:rPr>
+        <w:rFonts w:ascii="Wingdings" w:hAnsi="Wingdings" w:hint="default"/>
+        <w:sz w:val="20"/>
+      </w:rPr>
+    </w:lvl>
+    <w:lvl w:ilvl="6" w:tentative="1">
+      <w:start w:val="1"/>
+      <w:numFmt w:val="bullet"/>
+      <w:lvlText w:val=""/>
+      <w:lvlJc w:val="left"/>
+      <w:pPr>
+        <w:tabs>
+          <w:tab w:val="num" w:pos="5040"/>
+        </w:tabs>
+        <w:ind w:left="5040" w:hanging="360"/>
+      </w:pPr>
+      <w:rPr>
+        <w:rFonts w:ascii="Wingdings" w:hAnsi="Wingdings" w:hint="default"/>
+        <w:sz w:val="20"/>
+      </w:rPr>
+    </w:lvl>
+    <w:lvl w:ilvl="7" w:tentative="1">
+      <w:start w:val="1"/>
+      <w:numFmt w:val="bullet"/>
+      <w:lvlText w:val=""/>
+      <w:lvlJc w:val="left"/>
+      <w:pPr>
+        <w:tabs>
+          <w:tab w:val="num" w:pos="5760"/>
+        </w:tabs>
+        <w:ind w:left="5760" w:hanging="360"/>
+      </w:pPr>
+      <w:rPr>
+        <w:rFonts w:ascii="Wingdings" w:hAnsi="Wingdings" w:hint="default"/>
+        <w:sz w:val="20"/>
+      </w:rPr>
+    </w:lvl>
+    <w:lvl w:ilvl="8" w:tentative="1">
+      <w:start w:val="1"/>
+      <w:numFmt w:val="bullet"/>
+      <w:lvlText w:val=""/>
+      <w:lvlJc w:val="left"/>
+      <w:pPr>
+        <w:tabs>
+          <w:tab w:val="num" w:pos="6480"/>
+        </w:tabs>
+        <w:ind w:left="6480" w:hanging="360"/>
+      </w:pPr>
+      <w:rPr>
+        <w:rFonts w:ascii="Wingdings" w:hAnsi="Wingdings" w:hint="default"/>
+        <w:sz w:val="20"/>
+      </w:rPr>
+    </w:lvl>
+  </w:abstractNum>
+  <w:abstractNum w:abstractNumId="5" w15:restartNumberingAfterBreak="0">
     <w:nsid w:val="2D1D0076"/>
     <w:multiLevelType w:val="multilevel"/>
     <w:tmpl w:val="B8867BBC"/>
@@ -1214,7 +4419,305 @@
       </w:rPr>
     </w:lvl>
   </w:abstractNum>
-  <w:abstractNum w:abstractNumId="2" w15:restartNumberingAfterBreak="0">
+  <w:abstractNum w:abstractNumId="6" w15:restartNumberingAfterBreak="0">
+    <w:nsid w:val="3572143E"/>
+    <w:multiLevelType w:val="multilevel"/>
+    <w:tmpl w:val="9F9A585A"/>
+    <w:lvl w:ilvl="0">
+      <w:start w:val="1"/>
+      <w:numFmt w:val="bullet"/>
+      <w:lvlText w:val=""/>
+      <w:lvlJc w:val="left"/>
+      <w:pPr>
+        <w:tabs>
+          <w:tab w:val="num" w:pos="720"/>
+        </w:tabs>
+        <w:ind w:left="720" w:hanging="360"/>
+      </w:pPr>
+      <w:rPr>
+        <w:rFonts w:ascii="Symbol" w:hAnsi="Symbol" w:hint="default"/>
+        <w:sz w:val="20"/>
+      </w:rPr>
+    </w:lvl>
+    <w:lvl w:ilvl="1" w:tentative="1">
+      <w:start w:val="1"/>
+      <w:numFmt w:val="bullet"/>
+      <w:lvlText w:val="o"/>
+      <w:lvlJc w:val="left"/>
+      <w:pPr>
+        <w:tabs>
+          <w:tab w:val="num" w:pos="1440"/>
+        </w:tabs>
+        <w:ind w:left="1440" w:hanging="360"/>
+      </w:pPr>
+      <w:rPr>
+        <w:rFonts w:ascii="Courier New" w:hAnsi="Courier New" w:hint="default"/>
+        <w:sz w:val="20"/>
+      </w:rPr>
+    </w:lvl>
+    <w:lvl w:ilvl="2" w:tentative="1">
+      <w:start w:val="1"/>
+      <w:numFmt w:val="bullet"/>
+      <w:lvlText w:val=""/>
+      <w:lvlJc w:val="left"/>
+      <w:pPr>
+        <w:tabs>
+          <w:tab w:val="num" w:pos="2160"/>
+        </w:tabs>
+        <w:ind w:left="2160" w:hanging="360"/>
+      </w:pPr>
+      <w:rPr>
+        <w:rFonts w:ascii="Wingdings" w:hAnsi="Wingdings" w:hint="default"/>
+        <w:sz w:val="20"/>
+      </w:rPr>
+    </w:lvl>
+    <w:lvl w:ilvl="3" w:tentative="1">
+      <w:start w:val="1"/>
+      <w:numFmt w:val="bullet"/>
+      <w:lvlText w:val=""/>
+      <w:lvlJc w:val="left"/>
+      <w:pPr>
+        <w:tabs>
+          <w:tab w:val="num" w:pos="2880"/>
+        </w:tabs>
+        <w:ind w:left="2880" w:hanging="360"/>
+      </w:pPr>
+      <w:rPr>
+        <w:rFonts w:ascii="Wingdings" w:hAnsi="Wingdings" w:hint="default"/>
+        <w:sz w:val="20"/>
+      </w:rPr>
+    </w:lvl>
+    <w:lvl w:ilvl="4" w:tentative="1">
+      <w:start w:val="1"/>
+      <w:numFmt w:val="bullet"/>
+      <w:lvlText w:val=""/>
+      <w:lvlJc w:val="left"/>
+      <w:pPr>
+        <w:tabs>
+          <w:tab w:val="num" w:pos="3600"/>
+        </w:tabs>
+        <w:ind w:left="3600" w:hanging="360"/>
+      </w:pPr>
+      <w:rPr>
+        <w:rFonts w:ascii="Wingdings" w:hAnsi="Wingdings" w:hint="default"/>
+        <w:sz w:val="20"/>
+      </w:rPr>
+    </w:lvl>
+    <w:lvl w:ilvl="5" w:tentative="1">
+      <w:start w:val="1"/>
+      <w:numFmt w:val="bullet"/>
+      <w:lvlText w:val=""/>
+      <w:lvlJc w:val="left"/>
+      <w:pPr>
+        <w:tabs>
+          <w:tab w:val="num" w:pos="4320"/>
+        </w:tabs>
+        <w:ind w:left="4320" w:hanging="360"/>
+      </w:pPr>
+      <w:rPr>
+        <w:rFonts w:ascii="Wingdings" w:hAnsi="Wingdings" w:hint="default"/>
+        <w:sz w:val="20"/>
+      </w:rPr>
+    </w:lvl>
+    <w:lvl w:ilvl="6" w:tentative="1">
+      <w:start w:val="1"/>
+      <w:numFmt w:val="bullet"/>
+      <w:lvlText w:val=""/>
+      <w:lvlJc w:val="left"/>
+      <w:pPr>
+        <w:tabs>
+          <w:tab w:val="num" w:pos="5040"/>
+        </w:tabs>
+        <w:ind w:left="5040" w:hanging="360"/>
+      </w:pPr>
+      <w:rPr>
+        <w:rFonts w:ascii="Wingdings" w:hAnsi="Wingdings" w:hint="default"/>
+        <w:sz w:val="20"/>
+      </w:rPr>
+    </w:lvl>
+    <w:lvl w:ilvl="7" w:tentative="1">
+      <w:start w:val="1"/>
+      <w:numFmt w:val="bullet"/>
+      <w:lvlText w:val=""/>
+      <w:lvlJc w:val="left"/>
+      <w:pPr>
+        <w:tabs>
+          <w:tab w:val="num" w:pos="5760"/>
+        </w:tabs>
+        <w:ind w:left="5760" w:hanging="360"/>
+      </w:pPr>
+      <w:rPr>
+        <w:rFonts w:ascii="Wingdings" w:hAnsi="Wingdings" w:hint="default"/>
+        <w:sz w:val="20"/>
+      </w:rPr>
+    </w:lvl>
+    <w:lvl w:ilvl="8" w:tentative="1">
+      <w:start w:val="1"/>
+      <w:numFmt w:val="bullet"/>
+      <w:lvlText w:val=""/>
+      <w:lvlJc w:val="left"/>
+      <w:pPr>
+        <w:tabs>
+          <w:tab w:val="num" w:pos="6480"/>
+        </w:tabs>
+        <w:ind w:left="6480" w:hanging="360"/>
+      </w:pPr>
+      <w:rPr>
+        <w:rFonts w:ascii="Wingdings" w:hAnsi="Wingdings" w:hint="default"/>
+        <w:sz w:val="20"/>
+      </w:rPr>
+    </w:lvl>
+  </w:abstractNum>
+  <w:abstractNum w:abstractNumId="7" w15:restartNumberingAfterBreak="0">
+    <w:nsid w:val="360F0A84"/>
+    <w:multiLevelType w:val="multilevel"/>
+    <w:tmpl w:val="1180C3C2"/>
+    <w:lvl w:ilvl="0">
+      <w:start w:val="1"/>
+      <w:numFmt w:val="bullet"/>
+      <w:lvlText w:val=""/>
+      <w:lvlJc w:val="left"/>
+      <w:pPr>
+        <w:tabs>
+          <w:tab w:val="num" w:pos="720"/>
+        </w:tabs>
+        <w:ind w:left="720" w:hanging="360"/>
+      </w:pPr>
+      <w:rPr>
+        <w:rFonts w:ascii="Symbol" w:hAnsi="Symbol" w:hint="default"/>
+        <w:sz w:val="20"/>
+      </w:rPr>
+    </w:lvl>
+    <w:lvl w:ilvl="1" w:tentative="1">
+      <w:start w:val="1"/>
+      <w:numFmt w:val="bullet"/>
+      <w:lvlText w:val="o"/>
+      <w:lvlJc w:val="left"/>
+      <w:pPr>
+        <w:tabs>
+          <w:tab w:val="num" w:pos="1440"/>
+        </w:tabs>
+        <w:ind w:left="1440" w:hanging="360"/>
+      </w:pPr>
+      <w:rPr>
+        <w:rFonts w:ascii="Courier New" w:hAnsi="Courier New" w:hint="default"/>
+        <w:sz w:val="20"/>
+      </w:rPr>
+    </w:lvl>
+    <w:lvl w:ilvl="2" w:tentative="1">
+      <w:start w:val="1"/>
+      <w:numFmt w:val="bullet"/>
+      <w:lvlText w:val=""/>
+      <w:lvlJc w:val="left"/>
+      <w:pPr>
+        <w:tabs>
+          <w:tab w:val="num" w:pos="2160"/>
+        </w:tabs>
+        <w:ind w:left="2160" w:hanging="360"/>
+      </w:pPr>
+      <w:rPr>
+        <w:rFonts w:ascii="Wingdings" w:hAnsi="Wingdings" w:hint="default"/>
+        <w:sz w:val="20"/>
+      </w:rPr>
+    </w:lvl>
+    <w:lvl w:ilvl="3" w:tentative="1">
+      <w:start w:val="1"/>
+      <w:numFmt w:val="bullet"/>
+      <w:lvlText w:val=""/>
+      <w:lvlJc w:val="left"/>
+      <w:pPr>
+        <w:tabs>
+          <w:tab w:val="num" w:pos="2880"/>
+        </w:tabs>
+        <w:ind w:left="2880" w:hanging="360"/>
+      </w:pPr>
+      <w:rPr>
+        <w:rFonts w:ascii="Wingdings" w:hAnsi="Wingdings" w:hint="default"/>
+        <w:sz w:val="20"/>
+      </w:rPr>
+    </w:lvl>
+    <w:lvl w:ilvl="4" w:tentative="1">
+      <w:start w:val="1"/>
+      <w:numFmt w:val="bullet"/>
+      <w:lvlText w:val=""/>
+      <w:lvlJc w:val="left"/>
+      <w:pPr>
+        <w:tabs>
+          <w:tab w:val="num" w:pos="3600"/>
+        </w:tabs>
+        <w:ind w:left="3600" w:hanging="360"/>
+      </w:pPr>
+      <w:rPr>
+        <w:rFonts w:ascii="Wingdings" w:hAnsi="Wingdings" w:hint="default"/>
+        <w:sz w:val="20"/>
+      </w:rPr>
+    </w:lvl>
+    <w:lvl w:ilvl="5" w:tentative="1">
+      <w:start w:val="1"/>
+      <w:numFmt w:val="bullet"/>
+      <w:lvlText w:val=""/>
+      <w:lvlJc w:val="left"/>
+      <w:pPr>
+        <w:tabs>
+          <w:tab w:val="num" w:pos="4320"/>
+        </w:tabs>
+        <w:ind w:left="4320" w:hanging="360"/>
+      </w:pPr>
+      <w:rPr>
+        <w:rFonts w:ascii="Wingdings" w:hAnsi="Wingdings" w:hint="default"/>
+        <w:sz w:val="20"/>
+      </w:rPr>
+    </w:lvl>
+    <w:lvl w:ilvl="6" w:tentative="1">
+      <w:start w:val="1"/>
+      <w:numFmt w:val="bullet"/>
+      <w:lvlText w:val=""/>
+      <w:lvlJc w:val="left"/>
+      <w:pPr>
+        <w:tabs>
+          <w:tab w:val="num" w:pos="5040"/>
+        </w:tabs>
+        <w:ind w:left="5040" w:hanging="360"/>
+      </w:pPr>
+      <w:rPr>
+        <w:rFonts w:ascii="Wingdings" w:hAnsi="Wingdings" w:hint="default"/>
+        <w:sz w:val="20"/>
+      </w:rPr>
+    </w:lvl>
+    <w:lvl w:ilvl="7" w:tentative="1">
+      <w:start w:val="1"/>
+      <w:numFmt w:val="bullet"/>
+      <w:lvlText w:val=""/>
+      <w:lvlJc w:val="left"/>
+      <w:pPr>
+        <w:tabs>
+          <w:tab w:val="num" w:pos="5760"/>
+        </w:tabs>
+        <w:ind w:left="5760" w:hanging="360"/>
+      </w:pPr>
+      <w:rPr>
+        <w:rFonts w:ascii="Wingdings" w:hAnsi="Wingdings" w:hint="default"/>
+        <w:sz w:val="20"/>
+      </w:rPr>
+    </w:lvl>
+    <w:lvl w:ilvl="8" w:tentative="1">
+      <w:start w:val="1"/>
+      <w:numFmt w:val="bullet"/>
+      <w:lvlText w:val=""/>
+      <w:lvlJc w:val="left"/>
+      <w:pPr>
+        <w:tabs>
+          <w:tab w:val="num" w:pos="6480"/>
+        </w:tabs>
+        <w:ind w:left="6480" w:hanging="360"/>
+      </w:pPr>
+      <w:rPr>
+        <w:rFonts w:ascii="Wingdings" w:hAnsi="Wingdings" w:hint="default"/>
+        <w:sz w:val="20"/>
+      </w:rPr>
+    </w:lvl>
+  </w:abstractNum>
+  <w:abstractNum w:abstractNumId="8" w15:restartNumberingAfterBreak="0">
     <w:nsid w:val="3A3411B3"/>
     <w:multiLevelType w:val="multilevel"/>
     <w:tmpl w:val="46FEEF84"/>
@@ -1363,7 +4866,7 @@
       </w:rPr>
     </w:lvl>
   </w:abstractNum>
-  <w:abstractNum w:abstractNumId="3" w15:restartNumberingAfterBreak="0">
+  <w:abstractNum w:abstractNumId="9" w15:restartNumberingAfterBreak="0">
     <w:nsid w:val="3D2E58CB"/>
     <w:multiLevelType w:val="multilevel"/>
     <w:tmpl w:val="73588D00"/>
@@ -1512,7 +5015,156 @@
       </w:rPr>
     </w:lvl>
   </w:abstractNum>
-  <w:abstractNum w:abstractNumId="4" w15:restartNumberingAfterBreak="0">
+  <w:abstractNum w:abstractNumId="10" w15:restartNumberingAfterBreak="0">
+    <w:nsid w:val="40D20341"/>
+    <w:multiLevelType w:val="multilevel"/>
+    <w:tmpl w:val="14CAEDA2"/>
+    <w:lvl w:ilvl="0">
+      <w:start w:val="1"/>
+      <w:numFmt w:val="bullet"/>
+      <w:lvlText w:val=""/>
+      <w:lvlJc w:val="left"/>
+      <w:pPr>
+        <w:tabs>
+          <w:tab w:val="num" w:pos="720"/>
+        </w:tabs>
+        <w:ind w:left="720" w:hanging="360"/>
+      </w:pPr>
+      <w:rPr>
+        <w:rFonts w:ascii="Symbol" w:hAnsi="Symbol" w:hint="default"/>
+        <w:sz w:val="20"/>
+      </w:rPr>
+    </w:lvl>
+    <w:lvl w:ilvl="1" w:tentative="1">
+      <w:start w:val="1"/>
+      <w:numFmt w:val="bullet"/>
+      <w:lvlText w:val="o"/>
+      <w:lvlJc w:val="left"/>
+      <w:pPr>
+        <w:tabs>
+          <w:tab w:val="num" w:pos="1440"/>
+        </w:tabs>
+        <w:ind w:left="1440" w:hanging="360"/>
+      </w:pPr>
+      <w:rPr>
+        <w:rFonts w:ascii="Courier New" w:hAnsi="Courier New" w:hint="default"/>
+        <w:sz w:val="20"/>
+      </w:rPr>
+    </w:lvl>
+    <w:lvl w:ilvl="2" w:tentative="1">
+      <w:start w:val="1"/>
+      <w:numFmt w:val="bullet"/>
+      <w:lvlText w:val=""/>
+      <w:lvlJc w:val="left"/>
+      <w:pPr>
+        <w:tabs>
+          <w:tab w:val="num" w:pos="2160"/>
+        </w:tabs>
+        <w:ind w:left="2160" w:hanging="360"/>
+      </w:pPr>
+      <w:rPr>
+        <w:rFonts w:ascii="Wingdings" w:hAnsi="Wingdings" w:hint="default"/>
+        <w:sz w:val="20"/>
+      </w:rPr>
+    </w:lvl>
+    <w:lvl w:ilvl="3" w:tentative="1">
+      <w:start w:val="1"/>
+      <w:numFmt w:val="bullet"/>
+      <w:lvlText w:val=""/>
+      <w:lvlJc w:val="left"/>
+      <w:pPr>
+        <w:tabs>
+          <w:tab w:val="num" w:pos="2880"/>
+        </w:tabs>
+        <w:ind w:left="2880" w:hanging="360"/>
+      </w:pPr>
+      <w:rPr>
+        <w:rFonts w:ascii="Wingdings" w:hAnsi="Wingdings" w:hint="default"/>
+        <w:sz w:val="20"/>
+      </w:rPr>
+    </w:lvl>
+    <w:lvl w:ilvl="4" w:tentative="1">
+      <w:start w:val="1"/>
+      <w:numFmt w:val="bullet"/>
+      <w:lvlText w:val=""/>
+      <w:lvlJc w:val="left"/>
+      <w:pPr>
+        <w:tabs>
+          <w:tab w:val="num" w:pos="3600"/>
+        </w:tabs>
+        <w:ind w:left="3600" w:hanging="360"/>
+      </w:pPr>
+      <w:rPr>
+        <w:rFonts w:ascii="Wingdings" w:hAnsi="Wingdings" w:hint="default"/>
+        <w:sz w:val="20"/>
+      </w:rPr>
+    </w:lvl>
+    <w:lvl w:ilvl="5" w:tentative="1">
+      <w:start w:val="1"/>
+      <w:numFmt w:val="bullet"/>
+      <w:lvlText w:val=""/>
+      <w:lvlJc w:val="left"/>
+      <w:pPr>
+        <w:tabs>
+          <w:tab w:val="num" w:pos="4320"/>
+        </w:tabs>
+        <w:ind w:left="4320" w:hanging="360"/>
+      </w:pPr>
+      <w:rPr>
+        <w:rFonts w:ascii="Wingdings" w:hAnsi="Wingdings" w:hint="default"/>
+        <w:sz w:val="20"/>
+      </w:rPr>
+    </w:lvl>
+    <w:lvl w:ilvl="6" w:tentative="1">
+      <w:start w:val="1"/>
+      <w:numFmt w:val="bullet"/>
+      <w:lvlText w:val=""/>
+      <w:lvlJc w:val="left"/>
+      <w:pPr>
+        <w:tabs>
+          <w:tab w:val="num" w:pos="5040"/>
+        </w:tabs>
+        <w:ind w:left="5040" w:hanging="360"/>
+      </w:pPr>
+      <w:rPr>
+        <w:rFonts w:ascii="Wingdings" w:hAnsi="Wingdings" w:hint="default"/>
+        <w:sz w:val="20"/>
+      </w:rPr>
+    </w:lvl>
+    <w:lvl w:ilvl="7" w:tentative="1">
+      <w:start w:val="1"/>
+      <w:numFmt w:val="bullet"/>
+      <w:lvlText w:val=""/>
+      <w:lvlJc w:val="left"/>
+      <w:pPr>
+        <w:tabs>
+          <w:tab w:val="num" w:pos="5760"/>
+        </w:tabs>
+        <w:ind w:left="5760" w:hanging="360"/>
+      </w:pPr>
+      <w:rPr>
+        <w:rFonts w:ascii="Wingdings" w:hAnsi="Wingdings" w:hint="default"/>
+        <w:sz w:val="20"/>
+      </w:rPr>
+    </w:lvl>
+    <w:lvl w:ilvl="8" w:tentative="1">
+      <w:start w:val="1"/>
+      <w:numFmt w:val="bullet"/>
+      <w:lvlText w:val=""/>
+      <w:lvlJc w:val="left"/>
+      <w:pPr>
+        <w:tabs>
+          <w:tab w:val="num" w:pos="6480"/>
+        </w:tabs>
+        <w:ind w:left="6480" w:hanging="360"/>
+      </w:pPr>
+      <w:rPr>
+        <w:rFonts w:ascii="Wingdings" w:hAnsi="Wingdings" w:hint="default"/>
+        <w:sz w:val="20"/>
+      </w:rPr>
+    </w:lvl>
+  </w:abstractNum>
+  <w:abstractNum w:abstractNumId="11" w15:restartNumberingAfterBreak="0">
     <w:nsid w:val="54AA32C7"/>
     <w:multiLevelType w:val="multilevel"/>
     <w:tmpl w:val="5CFA5E52"/>
@@ -1661,7 +5313,7 @@
       </w:rPr>
     </w:lvl>
   </w:abstractNum>
-  <w:abstractNum w:abstractNumId="5" w15:restartNumberingAfterBreak="0">
+  <w:abstractNum w:abstractNumId="12" w15:restartNumberingAfterBreak="0">
     <w:nsid w:val="553352A7"/>
     <w:multiLevelType w:val="multilevel"/>
     <w:tmpl w:val="3D8A493A"/>
@@ -1774,7 +5426,7 @@
       </w:pPr>
     </w:lvl>
   </w:abstractNum>
-  <w:abstractNum w:abstractNumId="6" w15:restartNumberingAfterBreak="0">
+  <w:abstractNum w:abstractNumId="13" w15:restartNumberingAfterBreak="0">
     <w:nsid w:val="6C39168B"/>
     <w:multiLevelType w:val="multilevel"/>
     <w:tmpl w:val="150E1B22"/>
@@ -1923,7 +5575,322 @@
       </w:rPr>
     </w:lvl>
   </w:abstractNum>
-  <w:abstractNum w:abstractNumId="7" w15:restartNumberingAfterBreak="0">
+  <w:abstractNum w:abstractNumId="14" w15:restartNumberingAfterBreak="0">
+    <w:nsid w:val="710E77D8"/>
+    <w:multiLevelType w:val="hybridMultilevel"/>
+    <w:tmpl w:val="C86692D4"/>
+    <w:lvl w:ilvl="0" w:tplc="0C0A0001">
+      <w:start w:val="1"/>
+      <w:numFmt w:val="bullet"/>
+      <w:lvlText w:val=""/>
+      <w:lvlJc w:val="left"/>
+      <w:pPr>
+        <w:ind w:left="720" w:hanging="360"/>
+      </w:pPr>
+      <w:rPr>
+        <w:rFonts w:ascii="Symbol" w:hAnsi="Symbol" w:hint="default"/>
+      </w:rPr>
+    </w:lvl>
+    <w:lvl w:ilvl="1" w:tplc="0C0A0003" w:tentative="1">
+      <w:start w:val="1"/>
+      <w:numFmt w:val="bullet"/>
+      <w:lvlText w:val="o"/>
+      <w:lvlJc w:val="left"/>
+      <w:pPr>
+        <w:ind w:left="1440" w:hanging="360"/>
+      </w:pPr>
+      <w:rPr>
+        <w:rFonts w:ascii="Courier New" w:hAnsi="Courier New" w:cs="Courier New" w:hint="default"/>
+      </w:rPr>
+    </w:lvl>
+    <w:lvl w:ilvl="2" w:tplc="0C0A0005" w:tentative="1">
+      <w:start w:val="1"/>
+      <w:numFmt w:val="bullet"/>
+      <w:lvlText w:val=""/>
+      <w:lvlJc w:val="left"/>
+      <w:pPr>
+        <w:ind w:left="2160" w:hanging="360"/>
+      </w:pPr>
+      <w:rPr>
+        <w:rFonts w:ascii="Wingdings" w:hAnsi="Wingdings" w:hint="default"/>
+      </w:rPr>
+    </w:lvl>
+    <w:lvl w:ilvl="3" w:tplc="0C0A0001" w:tentative="1">
+      <w:start w:val="1"/>
+      <w:numFmt w:val="bullet"/>
+      <w:lvlText w:val=""/>
+      <w:lvlJc w:val="left"/>
+      <w:pPr>
+        <w:ind w:left="2880" w:hanging="360"/>
+      </w:pPr>
+      <w:rPr>
+        <w:rFonts w:ascii="Symbol" w:hAnsi="Symbol" w:hint="default"/>
+      </w:rPr>
+    </w:lvl>
+    <w:lvl w:ilvl="4" w:tplc="0C0A0003" w:tentative="1">
+      <w:start w:val="1"/>
+      <w:numFmt w:val="bullet"/>
+      <w:lvlText w:val="o"/>
+      <w:lvlJc w:val="left"/>
+      <w:pPr>
+        <w:ind w:left="3600" w:hanging="360"/>
+      </w:pPr>
+      <w:rPr>
+        <w:rFonts w:ascii="Courier New" w:hAnsi="Courier New" w:cs="Courier New" w:hint="default"/>
+      </w:rPr>
+    </w:lvl>
+    <w:lvl w:ilvl="5" w:tplc="0C0A0005" w:tentative="1">
+      <w:start w:val="1"/>
+      <w:numFmt w:val="bullet"/>
+      <w:lvlText w:val=""/>
+      <w:lvlJc w:val="left"/>
+      <w:pPr>
+        <w:ind w:left="4320" w:hanging="360"/>
+      </w:pPr>
+      <w:rPr>
+        <w:rFonts w:ascii="Wingdings" w:hAnsi="Wingdings" w:hint="default"/>
+      </w:rPr>
+    </w:lvl>
+    <w:lvl w:ilvl="6" w:tplc="0C0A0001" w:tentative="1">
+      <w:start w:val="1"/>
+      <w:numFmt w:val="bullet"/>
+      <w:lvlText w:val=""/>
+      <w:lvlJc w:val="left"/>
+      <w:pPr>
+        <w:ind w:left="5040" w:hanging="360"/>
+      </w:pPr>
+      <w:rPr>
+        <w:rFonts w:ascii="Symbol" w:hAnsi="Symbol" w:hint="default"/>
+      </w:rPr>
+    </w:lvl>
+    <w:lvl w:ilvl="7" w:tplc="0C0A0003" w:tentative="1">
+      <w:start w:val="1"/>
+      <w:numFmt w:val="bullet"/>
+      <w:lvlText w:val="o"/>
+      <w:lvlJc w:val="left"/>
+      <w:pPr>
+        <w:ind w:left="5760" w:hanging="360"/>
+      </w:pPr>
+      <w:rPr>
+        <w:rFonts w:ascii="Courier New" w:hAnsi="Courier New" w:cs="Courier New" w:hint="default"/>
+      </w:rPr>
+    </w:lvl>
+    <w:lvl w:ilvl="8" w:tplc="0C0A0005" w:tentative="1">
+      <w:start w:val="1"/>
+      <w:numFmt w:val="bullet"/>
+      <w:lvlText w:val=""/>
+      <w:lvlJc w:val="left"/>
+      <w:pPr>
+        <w:ind w:left="6480" w:hanging="360"/>
+      </w:pPr>
+      <w:rPr>
+        <w:rFonts w:ascii="Wingdings" w:hAnsi="Wingdings" w:hint="default"/>
+      </w:rPr>
+    </w:lvl>
+  </w:abstractNum>
+  <w:abstractNum w:abstractNumId="15" w15:restartNumberingAfterBreak="0">
+    <w:nsid w:val="71AF248F"/>
+    <w:multiLevelType w:val="multilevel"/>
+    <w:tmpl w:val="9BC41C9E"/>
+    <w:lvl w:ilvl="0">
+      <w:start w:val="1"/>
+      <w:numFmt w:val="decimal"/>
+      <w:lvlText w:val="%1."/>
+      <w:lvlJc w:val="left"/>
+      <w:pPr>
+        <w:tabs>
+          <w:tab w:val="num" w:pos="720"/>
+        </w:tabs>
+        <w:ind w:left="720" w:hanging="360"/>
+      </w:pPr>
+    </w:lvl>
+    <w:lvl w:ilvl="1" w:tentative="1">
+      <w:start w:val="1"/>
+      <w:numFmt w:val="decimal"/>
+      <w:lvlText w:val="%2."/>
+      <w:lvlJc w:val="left"/>
+      <w:pPr>
+        <w:tabs>
+          <w:tab w:val="num" w:pos="1440"/>
+        </w:tabs>
+        <w:ind w:left="1440" w:hanging="360"/>
+      </w:pPr>
+    </w:lvl>
+    <w:lvl w:ilvl="2" w:tentative="1">
+      <w:start w:val="1"/>
+      <w:numFmt w:val="decimal"/>
+      <w:lvlText w:val="%3."/>
+      <w:lvlJc w:val="left"/>
+      <w:pPr>
+        <w:tabs>
+          <w:tab w:val="num" w:pos="2160"/>
+        </w:tabs>
+        <w:ind w:left="2160" w:hanging="360"/>
+      </w:pPr>
+    </w:lvl>
+    <w:lvl w:ilvl="3" w:tentative="1">
+      <w:start w:val="1"/>
+      <w:numFmt w:val="decimal"/>
+      <w:lvlText w:val="%4."/>
+      <w:lvlJc w:val="left"/>
+      <w:pPr>
+        <w:tabs>
+          <w:tab w:val="num" w:pos="2880"/>
+        </w:tabs>
+        <w:ind w:left="2880" w:hanging="360"/>
+      </w:pPr>
+    </w:lvl>
+    <w:lvl w:ilvl="4" w:tentative="1">
+      <w:start w:val="1"/>
+      <w:numFmt w:val="decimal"/>
+      <w:lvlText w:val="%5."/>
+      <w:lvlJc w:val="left"/>
+      <w:pPr>
+        <w:tabs>
+          <w:tab w:val="num" w:pos="3600"/>
+        </w:tabs>
+        <w:ind w:left="3600" w:hanging="360"/>
+      </w:pPr>
+    </w:lvl>
+    <w:lvl w:ilvl="5" w:tentative="1">
+      <w:start w:val="1"/>
+      <w:numFmt w:val="decimal"/>
+      <w:lvlText w:val="%6."/>
+      <w:lvlJc w:val="left"/>
+      <w:pPr>
+        <w:tabs>
+          <w:tab w:val="num" w:pos="4320"/>
+        </w:tabs>
+        <w:ind w:left="4320" w:hanging="360"/>
+      </w:pPr>
+    </w:lvl>
+    <w:lvl w:ilvl="6" w:tentative="1">
+      <w:start w:val="1"/>
+      <w:numFmt w:val="decimal"/>
+      <w:lvlText w:val="%7."/>
+      <w:lvlJc w:val="left"/>
+      <w:pPr>
+        <w:tabs>
+          <w:tab w:val="num" w:pos="5040"/>
+        </w:tabs>
+        <w:ind w:left="5040" w:hanging="360"/>
+      </w:pPr>
+    </w:lvl>
+    <w:lvl w:ilvl="7" w:tentative="1">
+      <w:start w:val="1"/>
+      <w:numFmt w:val="decimal"/>
+      <w:lvlText w:val="%8."/>
+      <w:lvlJc w:val="left"/>
+      <w:pPr>
+        <w:tabs>
+          <w:tab w:val="num" w:pos="5760"/>
+        </w:tabs>
+        <w:ind w:left="5760" w:hanging="360"/>
+      </w:pPr>
+    </w:lvl>
+    <w:lvl w:ilvl="8" w:tentative="1">
+      <w:start w:val="1"/>
+      <w:numFmt w:val="decimal"/>
+      <w:lvlText w:val="%9."/>
+      <w:lvlJc w:val="left"/>
+      <w:pPr>
+        <w:tabs>
+          <w:tab w:val="num" w:pos="6480"/>
+        </w:tabs>
+        <w:ind w:left="6480" w:hanging="360"/>
+      </w:pPr>
+    </w:lvl>
+  </w:abstractNum>
+  <w:abstractNum w:abstractNumId="16" w15:restartNumberingAfterBreak="0">
+    <w:nsid w:val="757141FF"/>
+    <w:multiLevelType w:val="hybridMultilevel"/>
+    <w:tmpl w:val="A3F8D364"/>
+    <w:lvl w:ilvl="0" w:tplc="0C0A000F">
+      <w:start w:val="1"/>
+      <w:numFmt w:val="decimal"/>
+      <w:lvlText w:val="%1."/>
+      <w:lvlJc w:val="left"/>
+      <w:pPr>
+        <w:ind w:left="720" w:hanging="360"/>
+      </w:pPr>
+      <w:rPr>
+        <w:rFonts w:hint="default"/>
+      </w:rPr>
+    </w:lvl>
+    <w:lvl w:ilvl="1" w:tplc="0C0A0019" w:tentative="1">
+      <w:start w:val="1"/>
+      <w:numFmt w:val="lowerLetter"/>
+      <w:lvlText w:val="%2."/>
+      <w:lvlJc w:val="left"/>
+      <w:pPr>
+        <w:ind w:left="1440" w:hanging="360"/>
+      </w:pPr>
+    </w:lvl>
+    <w:lvl w:ilvl="2" w:tplc="0C0A001B" w:tentative="1">
+      <w:start w:val="1"/>
+      <w:numFmt w:val="lowerRoman"/>
+      <w:lvlText w:val="%3."/>
+      <w:lvlJc w:val="right"/>
+      <w:pPr>
+        <w:ind w:left="2160" w:hanging="180"/>
+      </w:pPr>
+    </w:lvl>
+    <w:lvl w:ilvl="3" w:tplc="0C0A000F" w:tentative="1">
+      <w:start w:val="1"/>
+      <w:numFmt w:val="decimal"/>
+      <w:lvlText w:val="%4."/>
+      <w:lvlJc w:val="left"/>
+      <w:pPr>
+        <w:ind w:left="2880" w:hanging="360"/>
+      </w:pPr>
+    </w:lvl>
+    <w:lvl w:ilvl="4" w:tplc="0C0A0019" w:tentative="1">
+      <w:start w:val="1"/>
+      <w:numFmt w:val="lowerLetter"/>
+      <w:lvlText w:val="%5."/>
+      <w:lvlJc w:val="left"/>
+      <w:pPr>
+        <w:ind w:left="3600" w:hanging="360"/>
+      </w:pPr>
+    </w:lvl>
+    <w:lvl w:ilvl="5" w:tplc="0C0A001B" w:tentative="1">
+      <w:start w:val="1"/>
+      <w:numFmt w:val="lowerRoman"/>
+      <w:lvlText w:val="%6."/>
+      <w:lvlJc w:val="right"/>
+      <w:pPr>
+        <w:ind w:left="4320" w:hanging="180"/>
+      </w:pPr>
+    </w:lvl>
+    <w:lvl w:ilvl="6" w:tplc="0C0A000F" w:tentative="1">
+      <w:start w:val="1"/>
+      <w:numFmt w:val="decimal"/>
+      <w:lvlText w:val="%7."/>
+      <w:lvlJc w:val="left"/>
+      <w:pPr>
+        <w:ind w:left="5040" w:hanging="360"/>
+      </w:pPr>
+    </w:lvl>
+    <w:lvl w:ilvl="7" w:tplc="0C0A0019" w:tentative="1">
+      <w:start w:val="1"/>
+      <w:numFmt w:val="lowerLetter"/>
+      <w:lvlText w:val="%8."/>
+      <w:lvlJc w:val="left"/>
+      <w:pPr>
+        <w:ind w:left="5760" w:hanging="360"/>
+      </w:pPr>
+    </w:lvl>
+    <w:lvl w:ilvl="8" w:tplc="0C0A001B" w:tentative="1">
+      <w:start w:val="1"/>
+      <w:numFmt w:val="lowerRoman"/>
+      <w:lvlText w:val="%9."/>
+      <w:lvlJc w:val="right"/>
+      <w:pPr>
+        <w:ind w:left="6480" w:hanging="180"/>
+      </w:pPr>
+    </w:lvl>
+  </w:abstractNum>
+  <w:abstractNum w:abstractNumId="17" w15:restartNumberingAfterBreak="0">
     <w:nsid w:val="774D1F5D"/>
     <w:multiLevelType w:val="hybridMultilevel"/>
     <w:tmpl w:val="15E8A782"/>
@@ -2012,28 +5979,150 @@
       </w:pPr>
     </w:lvl>
   </w:abstractNum>
+  <w:abstractNum w:abstractNumId="18" w15:restartNumberingAfterBreak="0">
+    <w:nsid w:val="7B5F38B8"/>
+    <w:multiLevelType w:val="hybridMultilevel"/>
+    <w:tmpl w:val="D4C642C6"/>
+    <w:lvl w:ilvl="0" w:tplc="0C0A000F">
+      <w:start w:val="1"/>
+      <w:numFmt w:val="decimal"/>
+      <w:lvlText w:val="%1."/>
+      <w:lvlJc w:val="left"/>
+      <w:pPr>
+        <w:ind w:left="720" w:hanging="360"/>
+      </w:pPr>
+      <w:rPr>
+        <w:rFonts w:hint="default"/>
+      </w:rPr>
+    </w:lvl>
+    <w:lvl w:ilvl="1" w:tplc="0C0A0019" w:tentative="1">
+      <w:start w:val="1"/>
+      <w:numFmt w:val="lowerLetter"/>
+      <w:lvlText w:val="%2."/>
+      <w:lvlJc w:val="left"/>
+      <w:pPr>
+        <w:ind w:left="1440" w:hanging="360"/>
+      </w:pPr>
+    </w:lvl>
+    <w:lvl w:ilvl="2" w:tplc="0C0A001B" w:tentative="1">
+      <w:start w:val="1"/>
+      <w:numFmt w:val="lowerRoman"/>
+      <w:lvlText w:val="%3."/>
+      <w:lvlJc w:val="right"/>
+      <w:pPr>
+        <w:ind w:left="2160" w:hanging="180"/>
+      </w:pPr>
+    </w:lvl>
+    <w:lvl w:ilvl="3" w:tplc="0C0A000F" w:tentative="1">
+      <w:start w:val="1"/>
+      <w:numFmt w:val="decimal"/>
+      <w:lvlText w:val="%4."/>
+      <w:lvlJc w:val="left"/>
+      <w:pPr>
+        <w:ind w:left="2880" w:hanging="360"/>
+      </w:pPr>
+    </w:lvl>
+    <w:lvl w:ilvl="4" w:tplc="0C0A0019" w:tentative="1">
+      <w:start w:val="1"/>
+      <w:numFmt w:val="lowerLetter"/>
+      <w:lvlText w:val="%5."/>
+      <w:lvlJc w:val="left"/>
+      <w:pPr>
+        <w:ind w:left="3600" w:hanging="360"/>
+      </w:pPr>
+    </w:lvl>
+    <w:lvl w:ilvl="5" w:tplc="0C0A001B" w:tentative="1">
+      <w:start w:val="1"/>
+      <w:numFmt w:val="lowerRoman"/>
+      <w:lvlText w:val="%6."/>
+      <w:lvlJc w:val="right"/>
+      <w:pPr>
+        <w:ind w:left="4320" w:hanging="180"/>
+      </w:pPr>
+    </w:lvl>
+    <w:lvl w:ilvl="6" w:tplc="0C0A000F" w:tentative="1">
+      <w:start w:val="1"/>
+      <w:numFmt w:val="decimal"/>
+      <w:lvlText w:val="%7."/>
+      <w:lvlJc w:val="left"/>
+      <w:pPr>
+        <w:ind w:left="5040" w:hanging="360"/>
+      </w:pPr>
+    </w:lvl>
+    <w:lvl w:ilvl="7" w:tplc="0C0A0019" w:tentative="1">
+      <w:start w:val="1"/>
+      <w:numFmt w:val="lowerLetter"/>
+      <w:lvlText w:val="%8."/>
+      <w:lvlJc w:val="left"/>
+      <w:pPr>
+        <w:ind w:left="5760" w:hanging="360"/>
+      </w:pPr>
+    </w:lvl>
+    <w:lvl w:ilvl="8" w:tplc="0C0A001B" w:tentative="1">
+      <w:start w:val="1"/>
+      <w:numFmt w:val="lowerRoman"/>
+      <w:lvlText w:val="%9."/>
+      <w:lvlJc w:val="right"/>
+      <w:pPr>
+        <w:ind w:left="6480" w:hanging="180"/>
+      </w:pPr>
+    </w:lvl>
+  </w:abstractNum>
   <w:num w:numId="1" w16cid:durableId="2022537509">
+    <w:abstractNumId w:val="3"/>
+  </w:num>
+  <w:num w:numId="2" w16cid:durableId="1072041831">
+    <w:abstractNumId w:val="17"/>
+  </w:num>
+  <w:num w:numId="3" w16cid:durableId="1973558736">
+    <w:abstractNumId w:val="11"/>
+  </w:num>
+  <w:num w:numId="4" w16cid:durableId="1457944001">
+    <w:abstractNumId w:val="12"/>
+  </w:num>
+  <w:num w:numId="5" w16cid:durableId="845945241">
+    <w:abstractNumId w:val="5"/>
+  </w:num>
+  <w:num w:numId="6" w16cid:durableId="1899436957">
+    <w:abstractNumId w:val="9"/>
+  </w:num>
+  <w:num w:numId="7" w16cid:durableId="882524790">
+    <w:abstractNumId w:val="13"/>
+  </w:num>
+  <w:num w:numId="8" w16cid:durableId="338235892">
+    <w:abstractNumId w:val="8"/>
+  </w:num>
+  <w:num w:numId="9" w16cid:durableId="767509877">
+    <w:abstractNumId w:val="15"/>
+  </w:num>
+  <w:num w:numId="10" w16cid:durableId="509566034">
+    <w:abstractNumId w:val="14"/>
+  </w:num>
+  <w:num w:numId="11" w16cid:durableId="467742265">
+    <w:abstractNumId w:val="4"/>
+  </w:num>
+  <w:num w:numId="12" w16cid:durableId="1773739998">
     <w:abstractNumId w:val="0"/>
   </w:num>
-  <w:num w:numId="2" w16cid:durableId="1072041831">
+  <w:num w:numId="13" w16cid:durableId="2126845659">
+    <w:abstractNumId w:val="6"/>
+  </w:num>
+  <w:num w:numId="14" w16cid:durableId="1304846510">
+    <w:abstractNumId w:val="1"/>
+  </w:num>
+  <w:num w:numId="15" w16cid:durableId="52392708">
+    <w:abstractNumId w:val="10"/>
+  </w:num>
+  <w:num w:numId="16" w16cid:durableId="1152982769">
     <w:abstractNumId w:val="7"/>
   </w:num>
-  <w:num w:numId="3" w16cid:durableId="1973558736">
-    <w:abstractNumId w:val="4"/>
+  <w:num w:numId="17" w16cid:durableId="1851093932">
+    <w:abstractNumId w:val="18"/>
   </w:num>
-  <w:num w:numId="4" w16cid:durableId="1457944001">
-    <w:abstractNumId w:val="5"/>
+  <w:num w:numId="18" w16cid:durableId="1188374198">
+    <w:abstractNumId w:val="16"/>
   </w:num>
-  <w:num w:numId="5" w16cid:durableId="845945241">
-    <w:abstractNumId w:val="1"/>
-  </w:num>
-  <w:num w:numId="6" w16cid:durableId="1899436957">
-    <w:abstractNumId w:val="3"/>
-  </w:num>
-  <w:num w:numId="7" w16cid:durableId="882524790">
-    <w:abstractNumId w:val="6"/>
-  </w:num>
-  <w:num w:numId="8" w16cid:durableId="338235892">
+  <w:num w:numId="19" w16cid:durableId="2137024262">
     <w:abstractNumId w:val="2"/>
   </w:num>
 </w:numbering>
@@ -3062,6 +7151,50 @@
       <w:szCs w:val="18"/>
     </w:rPr>
   </w:style>
+  <w:style w:type="paragraph" w:styleId="TDC1">
+    <w:name w:val="toc 1"/>
+    <w:basedOn w:val="Normal"/>
+    <w:next w:val="Normal"/>
+    <w:autoRedefine/>
+    <w:uiPriority w:val="39"/>
+    <w:unhideWhenUsed/>
+    <w:rsid w:val="00CE7EEB"/>
+  </w:style>
+  <w:style w:type="paragraph" w:styleId="TDC2">
+    <w:name w:val="toc 2"/>
+    <w:basedOn w:val="Normal"/>
+    <w:next w:val="Normal"/>
+    <w:autoRedefine/>
+    <w:uiPriority w:val="39"/>
+    <w:unhideWhenUsed/>
+    <w:rsid w:val="00CE7EEB"/>
+    <w:pPr>
+      <w:ind w:left="240"/>
+    </w:pPr>
+  </w:style>
+  <w:style w:type="paragraph" w:styleId="TDC3">
+    <w:name w:val="toc 3"/>
+    <w:basedOn w:val="Normal"/>
+    <w:next w:val="Normal"/>
+    <w:autoRedefine/>
+    <w:uiPriority w:val="39"/>
+    <w:unhideWhenUsed/>
+    <w:rsid w:val="00CE7EEB"/>
+    <w:pPr>
+      <w:ind w:left="480"/>
+    </w:pPr>
+  </w:style>
+  <w:style w:type="character" w:styleId="Hipervnculo">
+    <w:name w:val="Hyperlink"/>
+    <w:basedOn w:val="Fuentedeprrafopredeter"/>
+    <w:uiPriority w:val="99"/>
+    <w:unhideWhenUsed/>
+    <w:rsid w:val="00CE7EEB"/>
+    <w:rPr>
+      <w:color w:val="0563C1" w:themeColor="hyperlink"/>
+      <w:u w:val="single"/>
+    </w:rPr>
+  </w:style>
 </w:styles>
 </file>
 

</xml_diff>